<commit_message>
submission: complete authorship and harden comparator review
- Add standard two-author CRediT-style contribution statement
- Present StrainGE/StrainGST metrics alongside StrainScan-covered simulations with non-pooling caveats
- Correct failure-as-absence statistics to use all 15 species and recall-only handling of no-report failures
- Add current multi-species rerun driver, provenance, database hashes and checksums
- Enforce completed-status gates in StrainGE scoring
- Scope matched benchmark subset, archived timing and current-source accuracy claims
- Repair introduction, headings, references, comparator wording and reviewer-flagged overclaims
- Regenerate figures, assembled manuscripts and readable DOCX
</commit_message>
<xml_diff>
--- a/manuscript/Strain2bScan_manuscript_figures_tables_2026-10-13.docx
+++ b/manuscript/Strain2bScan_manuscript_figures_tables_2026-10-13.docx
@@ -149,13 +149,13 @@
         <w:t xml:space="preserve"> </w:t>
       </w:r>
       <w:r>
-        <w:t xml:space="preserve">in the 99%-human-DNA mock. In shotgun comparisons, Strain2bScan was the only tested tool that</w:t>
-      </w:r>
-      <w:r>
-        <w:t xml:space="preserve"> </w:t>
-      </w:r>
-      <w:r>
-        <w:t xml:space="preserve">preserved detection and abundance at 99% host. In a</w:t>
+        <w:t xml:space="preserve">in the 99%-human-DNA mock. In the primary four-mock shotgun comparison, Strain2bScan was the only tested tool preserving</w:t>
+      </w:r>
+      <w:r>
+        <w:t xml:space="preserve"> </w:t>
+      </w:r>
+      <w:r>
+        <w:t xml:space="preserve">detection and abundance at 99% host. In a</w:t>
       </w:r>
       <w:r>
         <w:t xml:space="preserve"> </w:t>
@@ -167,7 +167,7 @@
         <w:t xml:space="preserve"> </w:t>
       </w:r>
       <w:r>
-        <w:t xml:space="preserve">paired recall and F1 differences were +0.063 and +0.005; failure-aware values were +0.127 and +0.076, with intervals including zero.</w:t>
+        <w:t xml:space="preserve">paired recall/F1 differences were +0.063 and +0.005; failure-as-absence recall was +0.127, with an interval excluding zero.</w:t>
       </w:r>
       <w:r>
         <w:t xml:space="preserve"> </w:t>
@@ -465,6 +465,18 @@
       <w:pPr>
         <w:pStyle w:val="BodyText"/>
       </w:pPr>
+      <w:r>
+        <w:t xml:space="preserve">Reduced-representation sequencing addresses both. Type-IIB restriction (</w:t>
+      </w:r>
+      <w:r>
+        <w:t xml:space="preserve">“2bRAD”</w:t>
+      </w:r>
+      <w:r>
+        <w:t xml:space="preserve">) digestion releases a</w:t>
+      </w:r>
+      <w:r>
+        <w:t xml:space="preserve"> </w:t>
+      </w:r>
       <w:r>
         <w:t xml:space="preserve">sparse, reproducible set of fixed-length tags (roughly 1–2 % of the genome) [5]. Applied as a wet-lab</w:t>
       </w:r>
@@ -1051,16 +1063,17 @@
       </w:r>
     </w:p>
     <w:bookmarkEnd w:id="13"/>
-    <w:bookmarkStart w:id="18" w:name="X70ed9a4f60922c6b27c98919ccef07861f63c20"/>
+    <w:bookmarkStart w:id="14" w:name="X70ed9a4f60922c6b27c98919ccef07861f63c20"/>
     <w:p>
       <w:pPr>
-        <w:pStyle w:val="Heading3"/>
+        <w:pStyle w:val="Heading4"/>
       </w:pPr>
       <w:r>
         <w:t xml:space="preserve">Part I; Native 2bRAD-M for low-biomass, high-host microbiomes</w:t>
       </w:r>
     </w:p>
-    <w:bookmarkStart w:id="14" w:name="Xd8ff357b7b2ad9624fa3ebaba3da23f4034c1a3"/>
+    <w:bookmarkEnd w:id="14"/>
+    <w:bookmarkStart w:id="15" w:name="Xd8ff357b7b2ad9624fa3ebaba3da23f4034c1a3"/>
     <w:p>
       <w:pPr>
         <w:pStyle w:val="Heading4"/>
@@ -1107,8 +1120,8 @@
         <w:t xml:space="preserve">direct profiling of native BcgI 2bRAD-M libraries.</w:t>
       </w:r>
     </w:p>
-    <w:bookmarkEnd w:id="14"/>
-    <w:bookmarkStart w:id="15" w:name="X485368ab92be74fe91ab47e960d35af9259b225"/>
+    <w:bookmarkEnd w:id="15"/>
+    <w:bookmarkStart w:id="16" w:name="X485368ab92be74fe91ab47e960d35af9259b225"/>
     <w:p>
       <w:pPr>
         <w:pStyle w:val="Heading4"/>
@@ -1197,7 +1210,7 @@
         <w:t xml:space="preserve"> </w:t>
       </w:r>
       <w:r>
-        <w:t xml:space="preserve">threshold, although AUPR was 1.0. Together, the mocks reveal a ~1× marker-depth noise floor: true strains</w:t>
+        <w:t xml:space="preserve">threshold, although AUPR was 1.0. Together, the mocks show a ~1× marker-depth noise floor: true strains</w:t>
       </w:r>
       <w:r>
         <w:t xml:space="preserve"> </w:t>
@@ -1218,8 +1231,8 @@
         <w:t xml:space="preserve">(Fig S3).</w:t>
       </w:r>
     </w:p>
-    <w:bookmarkEnd w:id="15"/>
-    <w:bookmarkStart w:id="16" w:name="Xdf2138b756c37bd80e09a457da330f1e68217ea"/>
+    <w:bookmarkEnd w:id="16"/>
+    <w:bookmarkStart w:id="17" w:name="Xdf2138b756c37bd80e09a457da330f1e68217ea"/>
     <w:p>
       <w:pPr>
         <w:pStyle w:val="Heading4"/>
@@ -1300,8 +1313,8 @@
         <w:t xml:space="preserve">(0.327 versus 0.696; p = 8.05 × 10⁻¹⁹), indicating a stable, person-specific strain signature.</w:t>
       </w:r>
     </w:p>
-    <w:bookmarkEnd w:id="16"/>
-    <w:bookmarkStart w:id="17" w:name="X4cb5900bf7e88f247d4a5ba057da679e71747ef"/>
+    <w:bookmarkEnd w:id="17"/>
+    <w:bookmarkStart w:id="18" w:name="X4cb5900bf7e88f247d4a5ba057da679e71747ef"/>
     <w:p>
       <w:pPr>
         <w:pStyle w:val="Heading4"/>
@@ -1372,18 +1385,18 @@
         <w:t xml:space="preserve">(Table S3).</w:t>
       </w:r>
     </w:p>
-    <w:bookmarkEnd w:id="17"/>
     <w:bookmarkEnd w:id="18"/>
-    <w:bookmarkStart w:id="26" w:name="X2d4bd352db48c0b3eb5599d81696e178b1530f1"/>
+    <w:bookmarkStart w:id="19" w:name="X2d4bd352db48c0b3eb5599d81696e178b1530f1"/>
     <w:p>
       <w:pPr>
-        <w:pStyle w:val="Heading3"/>
+        <w:pStyle w:val="Heading4"/>
       </w:pPr>
       <w:r>
         <w:t xml:space="preserve">Part II; Conventional metagenomes at community scale</w:t>
       </w:r>
     </w:p>
-    <w:bookmarkStart w:id="19" w:name="X150e1aaafea2db0593a7d498b29ba5834c5d4c6"/>
+    <w:bookmarkEnd w:id="19"/>
+    <w:bookmarkStart w:id="20" w:name="X150e1aaafea2db0593a7d498b29ba5834c5d4c6"/>
     <w:p>
       <w:pPr>
         <w:pStyle w:val="Heading4"/>
@@ -1446,8 +1459,8 @@
         <w:t xml:space="preserve">and sample count; the projected advantage was 121–146× (Fig 9C).</w:t>
       </w:r>
     </w:p>
-    <w:bookmarkEnd w:id="19"/>
-    <w:bookmarkStart w:id="20" w:name="Xd6742f58820982bc729c35d994f44ede39f649d"/>
+    <w:bookmarkEnd w:id="20"/>
+    <w:bookmarkStart w:id="21" w:name="Xd6742f58820982bc729c35d994f44ede39f649d"/>
     <w:p>
       <w:pPr>
         <w:pStyle w:val="Heading4"/>
@@ -1578,14 +1591,14 @@
         <w:t xml:space="preserve">independent validations of strain identity.</w:t>
       </w:r>
     </w:p>
-    <w:bookmarkEnd w:id="20"/>
-    <w:bookmarkStart w:id="21" w:name="Xe72d69df90e2dbc10251075c358367f3ad9f315"/>
+    <w:bookmarkEnd w:id="21"/>
+    <w:bookmarkStart w:id="22" w:name="X5ce8ebd177e5bc6f4579fdfb2160dd6fe2bbdba"/>
     <w:p>
       <w:pPr>
         <w:pStyle w:val="Heading4"/>
       </w:pPr>
       <w:r>
-        <w:t xml:space="preserve">Systematic head-to-head on a 15-species simulated benchmark (Fig 10, Tables 1–3)</w:t>
+        <w:t xml:space="preserve">Matched current-source regression on a 15-species simulated benchmark (Fig 10, Tables 1–3)</w:t>
       </w:r>
     </w:p>
     <w:p>
@@ -1599,7 +1612,7 @@
         <w:t xml:space="preserve"> </w:t>
       </w:r>
       <w:r>
-        <w:t xml:space="preserve">same simulated reads. Each tool was scored in its own 0.95-similarity cluster space. The current</w:t>
+        <w:t xml:space="preserve">same simulated reads. The comparator used a prespecified non-random matched subset: one replicate per design cell (225 of 2,025 single-species samples; 11.1%) and four of 15 communities per depth (12 of 60). Each tool was scored in its own 0.95-similarity cluster space. The current</w:t>
       </w:r>
       <w:r>
         <w:t xml:space="preserve"> </w:t>
@@ -1679,7 +1692,7 @@
         <w:t xml:space="preserve"> </w:t>
       </w:r>
       <w:r>
-        <w:t xml:space="preserve">non-monotonic (Table 2). Multi-species F1 was lower for Strain2bScan at all three depths (Table 3).</w:t>
+        <w:t xml:space="preserve">non-monotonic (Table 2). Multi-species F1 was lower for Strain2bScan at all three depths (Table 3). StrainGE/StrainGST was also run for every primary StrainScan-covered simulation benchmark and all four ATCC WMS mocks; its 0.90-space metrics are shown alongside the 0.95-space comparisons without pooling (Tables 1–3, 9). The supplementary StrainScan-curated-database subset in Supplementary Fig S5 was not rerun with StrainGE.</w:t>
       </w:r>
     </w:p>
     <w:p>
@@ -1687,7 +1700,7 @@
         <w:pStyle w:val="BodyText"/>
       </w:pPr>
       <w:r>
-        <w:t xml:space="preserve">A prespecified failure-aware sensitivity retained all 225 intended entries and scored each of the 21 absent StrainScan reports as zero detection. This analysis shifted the mean Strain2bScan-minus-StrainScan differences to +0.127 recall (95% species-cluster bootstrap CI −0.020 to 0.176) and +0.076 F1 (−0.075 to 0.120); both intervals included zero. Fifteen</w:t>
+        <w:t xml:space="preserve">A prespecified failure-as-absence sensitivity retained all 225 intended entries and scored recall for each of the 21 absent StrainScan reports as zero. This analysis shifted the mean recall difference to +0.127 (95% species-cluster bootstrap CI 0.007 to 0.248); the no-call rate was 9.33%. Current-source outputs differed from the archived 2025 Strain2bScan table for 101 of 225 metric triplets, motivating use of the current rerun rather than the historical accuracy columns. Precision and F1 were not assigned to no-report failures. Fifteen</w:t>
       </w:r>
       <w:r>
         <w:t xml:space="preserve"> </w:t>
@@ -1785,7 +1798,7 @@
         <w:t xml:space="preserve"> </w:t>
       </w:r>
       <w:r>
-        <w:t xml:space="preserve">built and profiled this species. This discrepancy underscores resource sensitivity. StrainScan build</w:t>
+        <w:t xml:space="preserve">built and profiled this species. This discrepancy illustrates resource sensitivity. StrainScan build</w:t>
       </w:r>
       <w:r>
         <w:t xml:space="preserve"> </w:t>
@@ -1794,8 +1807,8 @@
         <w:t xml:space="preserve">times were obtained under linux/amd64 emulation and are upper bounds.</w:t>
       </w:r>
     </w:p>
-    <w:bookmarkEnd w:id="21"/>
-    <w:bookmarkStart w:id="22" w:name="X22963e06b1e091172d497d5d5b4e3b6f35692f6"/>
+    <w:bookmarkEnd w:id="22"/>
+    <w:bookmarkStart w:id="23" w:name="X22963e06b1e091172d497d5d5b4e3b6f35692f6"/>
     <w:p>
       <w:pPr>
         <w:pStyle w:val="Heading4"/>
@@ -1907,11 +1920,11 @@
         <w:t xml:space="preserve"> </w:t>
       </w:r>
       <w:r>
-        <w:t xml:space="preserve">two mocks. The host-contamination result therefore should not be read as uniform clean-sample superiority.</w:t>
+        <w:t xml:space="preserve">two mocks. The host-contamination result therefore should not be read as uniform clean-sample performance advantage.</w:t>
       </w:r>
     </w:p>
-    <w:bookmarkEnd w:id="22"/>
-    <w:bookmarkStart w:id="23" w:name="Xe12cf1603898f8480561ca31e3251cd0966afb6"/>
+    <w:bookmarkEnd w:id="23"/>
+    <w:bookmarkStart w:id="24" w:name="Xe12cf1603898f8480561ca31e3251cd0966afb6"/>
     <w:p>
       <w:pPr>
         <w:pStyle w:val="Heading4"/>
@@ -2388,8 +2401,8 @@
         <w:t xml:space="preserve">inferred from a nearest-relative call (Table 7).</w:t>
       </w:r>
     </w:p>
-    <w:bookmarkEnd w:id="23"/>
-    <w:bookmarkStart w:id="24" w:name="comparator-scope"/>
+    <w:bookmarkEnd w:id="24"/>
+    <w:bookmarkStart w:id="25" w:name="comparator-scope"/>
     <w:p>
       <w:pPr>
         <w:pStyle w:val="Heading4"/>
@@ -2442,8 +2455,8 @@
         <w:t xml:space="preserve">reported separately rather than pooled with the primary same-assay comparisons (Table 8).</w:t>
       </w:r>
     </w:p>
-    <w:bookmarkEnd w:id="24"/>
-    <w:bookmarkStart w:id="25" w:name="X5e0c8d055bacba66c0b64e91a29a68ccf265fae"/>
+    <w:bookmarkEnd w:id="25"/>
+    <w:bookmarkStart w:id="26" w:name="X5e0c8d055bacba66c0b64e91a29a68ccf265fae"/>
     <w:p>
       <w:pPr>
         <w:pStyle w:val="Heading4"/>
@@ -2558,7 +2571,6 @@
         <w:t xml:space="preserve">analysis.</w:t>
       </w:r>
     </w:p>
-    <w:bookmarkEnd w:id="25"/>
     <w:bookmarkEnd w:id="26"/>
     <w:bookmarkEnd w:id="27"/>
     <w:bookmarkStart w:id="28" w:name="discussion"/>
@@ -2762,7 +2774,7 @@
         <w:t xml:space="preserve"> </w:t>
       </w:r>
       <w:r>
-        <w:t xml:space="preserve">framework rather than uniform superiority.</w:t>
+        <w:t xml:space="preserve">framework rather than uniform performance advantage.</w:t>
       </w:r>
     </w:p>
     <w:p>
@@ -3455,7 +3467,7 @@
         <w:t xml:space="preserve"> </w:t>
       </w:r>
       <w:r>
-        <w:t xml:space="preserve">rerun; StrainGR variant calling and native-2bRAD input for StrainGE remain untested, and a full StrainGR</w:t>
+        <w:t xml:space="preserve">rerun; StrainGR variant calling and native-2bRAD input for StrainGE remain untested; StrainGST covered the primary simulation and mock benchmarks but not the supplementary StrainScan-curated-database subset, and a full StrainGR</w:t>
       </w:r>
       <w:r>
         <w:t xml:space="preserve"> </w:t>
@@ -9818,7 +9830,7 @@
         <w:t xml:space="preserve"> </w:t>
       </w:r>
       <w:r>
-        <w:t xml:space="preserve">AUPR (abundance-threshold sweep, Ye et al. [25]), and Bray–Curtis and L2 similarity to the truth profile;</w:t>
+        <w:t xml:space="preserve">AUPR (abundance-threshold sweep, Ye et al. [24]), and Bray–Curtis and L2 similarity to the truth profile;</w:t>
       </w:r>
       <w:r>
         <w:t xml:space="preserve"> </w:t>
@@ -9907,13 +9919,25 @@
         <w:t xml:space="preserve"> </w:t>
       </w:r>
       <w:r>
-        <w:t xml:space="preserve">abundances → Bray–Curtis → PERMANOVA [26] (adonis, subject/timepoint factors) and leave-one-timepoint-out</w:t>
-      </w:r>
-      <w:r>
-        <w:t xml:space="preserve"> </w:t>
-      </w:r>
-      <w:r>
-        <w:t xml:space="preserve">1-NN host classification; shotgun R1 (in-silico BcgI) compared to native 2bRAD calls per sample. Full</w:t>
+        <w:t xml:space="preserve">abundances → Bray–Curtis → PERMANOVA [25] (adonis, subject/timepoint factors) and leave-one-timepoint-out</w:t>
+      </w:r>
+      <w:r>
+        <w:t xml:space="preserve"> </w:t>
+      </w:r>
+      <w:r>
+        <w:t xml:space="preserve">Classification uncertainty used a subject-aware cluster bootstrap with 20,000 resamples: all four timepoints</w:t>
+      </w:r>
+      <w:r>
+        <w:t xml:space="preserve"> </w:t>
+      </w:r>
+      <w:r>
+        <w:t xml:space="preserve">were retained together and the strain-minus-species accuracy difference was summarized with a 95% percentile</w:t>
+      </w:r>
+      <w:r>
+        <w:t xml:space="preserve"> </w:t>
+      </w:r>
+      <w:r>
+        <w:t xml:space="preserve">interval. 1-NN host classification; shotgun R1 (in-silico BcgI) compared to native 2bRAD calls per sample. Full</w:t>
       </w:r>
       <w:r>
         <w:t xml:space="preserve"> </w:t>
@@ -9991,7 +10015,7 @@
           <w:b/>
           <w:bCs/>
         </w:rPr>
-        <w:t xml:space="preserve">Systematic head-to-head on a 15-species simulated benchmark (Fig 10, Table 1–3).</w:t>
+        <w:t xml:space="preserve">Matched current-source regression on a 15-species simulated benchmark (Fig 10, Table 1–3).</w:t>
       </w:r>
       <w:r>
         <w:t xml:space="preserve"> </w:t>
@@ -10141,7 +10165,7 @@
         <w:t xml:space="preserve"> </w:t>
       </w:r>
       <w:r>
-        <w:t xml:space="preserve">The Strain2bScan systematic rerun used source commit</w:t>
+        <w:t xml:space="preserve">The Strain2bScan matched current-source rerun used source commit</w:t>
       </w:r>
       <w:r>
         <w:t xml:space="preserve"> </w:t>
@@ -10156,6 +10180,24 @@
         <w:t xml:space="preserve"> </w:t>
       </w:r>
       <w:r>
+        <w:t xml:space="preserve">(tag</w:t>
+      </w:r>
+      <w:r>
+        <w:t xml:space="preserve"> </w:t>
+      </w:r>
+      <w:r>
+        <w:rPr>
+          <w:rStyle w:val="VerbatimChar"/>
+        </w:rPr>
+        <w:t xml:space="preserve">benchmark-v0.1.1-6ae760c</w:t>
+      </w:r>
+      <w:r>
+        <w:t xml:space="preserve">)</w:t>
+      </w:r>
+      <w:r>
+        <w:t xml:space="preserve"> </w:t>
+      </w:r>
+      <w:r>
         <w:t xml:space="preserve">(release binary SHA-256</w:t>
       </w:r>
       <w:r>
@@ -10249,7 +10291,7 @@
         <w:t xml:space="preserve"> </w:t>
       </w:r>
       <w:r>
-        <w:t xml:space="preserve">bioconda) is Linux-x86-only; it ships Dashing [27] and jellyfish [28] executables, a Python-3.7</w:t>
+        <w:t xml:space="preserve">bioconda) is Linux-x86-only; it ships Dashing [26] and jellyfish [27] executables, a Python-3.7</w:t>
       </w:r>
       <w:r>
         <w:t xml:space="preserve"> </w:t>
@@ -11095,7 +11137,7 @@
         <w:pStyle w:val="BodyText"/>
       </w:pPr>
       <w:r>
-        <w:t xml:space="preserve">For cohort-specific compatibility testing, six PRJNA1191225 isolate read sets were assembled with SPAdes 4.3.0 [29]</w:t>
+        <w:t xml:space="preserve">For cohort-specific compatibility testing, six PRJNA1191225 isolate read sets were assembled with SPAdes 4.3.0 [28]</w:t>
       </w:r>
       <w:r>
         <w:t xml:space="preserve"> </w:t>
@@ -11562,7 +11604,33 @@
         <w:pStyle w:val="FirstParagraph"/>
       </w:pPr>
       <w:r>
-        <w:t xml:space="preserve">[xxxx]</w:t>
+        <w:rPr>
+          <w:b/>
+          <w:bCs/>
+        </w:rPr>
+        <w:t xml:space="preserve">Y.Z.:</w:t>
+      </w:r>
+      <w:r>
+        <w:t xml:space="preserve"> </w:t>
+      </w:r>
+      <w:r>
+        <w:t xml:space="preserve">Conceptualization, Methodology, Software, Validation, Formal analysis, Investigation, Data curation, Visualization, and Writing – original draft.</w:t>
+      </w:r>
+      <w:r>
+        <w:t xml:space="preserve"> </w:t>
+      </w:r>
+      <w:r>
+        <w:rPr>
+          <w:b/>
+          <w:bCs/>
+        </w:rPr>
+        <w:t xml:space="preserve">S.H.:</w:t>
+      </w:r>
+      <w:r>
+        <w:t xml:space="preserve"> </w:t>
+      </w:r>
+      <w:r>
+        <w:t xml:space="preserve">Conceptualization, Resources, Supervision, Funding acquisition, Writing – review &amp; editing, and Project administration. Both authors read and approved the final manuscript.</w:t>
       </w:r>
     </w:p>
     <w:bookmarkEnd w:id="40"/>
@@ -11598,7 +11666,7 @@
         <w:pStyle w:val="FirstParagraph"/>
       </w:pPr>
       <w:r>
-        <w:t xml:space="preserve">The Strain2bScan source code is available at https://github.com/HuangShiLab/Strain2bScan. Derived tables, benchmark configurations, checksums and assembly scripts are available at https://github.com/HuangShiLab/Strain2bScan-paper (paper-2026-10-12 tag). Public human metagenome reads used in the exploratory analyses are from PRJNA1131785, PRJNA288562, PRJNA1517970, PRJNA1191223 and PRJNA1191225. Commercial ATCC mock standards are identified by their catalogue names in the manuscript. No new human subject data were generated for this study.</w:t>
+        <w:t xml:space="preserve">The Strain2bScan source code is available at https://github.com/HuangShiLab/Strain2bScan. Derived tables, benchmark configurations, checksums and assembly scripts are available at https://github.com/HuangShiLab/Strain2bScan-paper (paper-2026-10-13-submission tag). Public human metagenome reads used in the exploratory analyses are from PRJNA1131785, PRJNA288562, PRJNA1517970, PRJNA1191223 and PRJNA1191225. Commercial ATCC mock standards are identified by their catalogue names in the manuscript. No new human subject data were generated for this study.</w:t>
       </w:r>
     </w:p>
     <w:bookmarkEnd w:id="42"/>
@@ -12064,7 +12132,7 @@
           <w:b/>
           <w:bCs/>
         </w:rPr>
-        <w:t xml:space="preserve">Figure 4. Reference degradation reduces strain-identification accuracy (all 15 species).</w:t>
+        <w:t xml:space="preserve">Figure 4. Reference degradation reduces strain-identification accuracy (15 species assessed; medians use 14 resolvable species).</w:t>
       </w:r>
       <w:r>
         <w:t xml:space="preserve"> </w:t>
@@ -13479,7 +13547,7 @@
         <w:t xml:space="preserve">M. tuberculosis</w:t>
       </w:r>
       <w:r>
-        <w:t xml:space="preserve">; k = 2/3/5; depths 0.5–10×); each tool was scored in its own 0.95-similarity cluster space. Cluster-count columns are each tool’s own 0.95 partitions of the common species pool. Current Strain2bScan values are from source commit</w:t>
+        <w:t xml:space="preserve">; k = 2/3/5; depths 0.5–10×); each tool was scored in its own 0.95-similarity cluster space. Cluster-count columns are each tool’s own 0.95 partitions of the common species pool. StrainGE F1 uses all 15 species-specific tests in its own 0.90-reference space and is not pooled with the 0.95-space columns. Current Strain2bScan values are from source commit</w:t>
       </w:r>
       <w:r>
         <w:t xml:space="preserve"> </w:t>
@@ -13500,7 +13568,7 @@
         <w:rPr>
           <w:rStyle w:val="VerbatimChar"/>
         </w:rPr>
-        <w:t xml:space="preserve">results/strainscan_rerun/current_paired_persample.tsv</w:t>
+        <w:t xml:space="preserve">results/strainscan_rerun/current_single_persample.tsv</w:t>
       </w:r>
       <w:r>
         <w:t xml:space="preserve">. Build cost is the archived timing benchmark (Strain2bScan native arm64; StrainScan</w:t>
@@ -13573,19 +13641,20 @@
         <w:tblLook w:firstRow="1" w:lastRow="0" w:firstColumn="0" w:lastColumn="0" w:noHBand="0" w:noVBand="0" w:val="0020"/>
       </w:tblPr>
       <w:tblGrid>
-        <w:gridCol w:w="609"/>
-        <w:gridCol w:w="609"/>
-        <w:gridCol w:w="609"/>
-        <w:gridCol w:w="609"/>
-        <w:gridCol w:w="609"/>
-        <w:gridCol w:w="609"/>
-        <w:gridCol w:w="609"/>
-        <w:gridCol w:w="609"/>
-        <w:gridCol w:w="609"/>
-        <w:gridCol w:w="609"/>
-        <w:gridCol w:w="609"/>
-        <w:gridCol w:w="609"/>
-        <w:gridCol w:w="609"/>
+        <w:gridCol w:w="565"/>
+        <w:gridCol w:w="565"/>
+        <w:gridCol w:w="565"/>
+        <w:gridCol w:w="565"/>
+        <w:gridCol w:w="565"/>
+        <w:gridCol w:w="565"/>
+        <w:gridCol w:w="565"/>
+        <w:gridCol w:w="565"/>
+        <w:gridCol w:w="565"/>
+        <w:gridCol w:w="565"/>
+        <w:gridCol w:w="565"/>
+        <w:gridCol w:w="565"/>
+        <w:gridCol w:w="565"/>
+        <w:gridCol w:w="565"/>
       </w:tblGrid>
       <w:tr>
         <w:trPr>
@@ -13827,6 +13896,26 @@
                 <w:b/>
                 <w:sz w:val="14"/>
               </w:rPr>
+              <w:t xml:space="preserve">Separate StrainGE F1 (0.90-space)†</w:t>
+            </w:r>
+          </w:p>
+        </w:tc>
+        <w:tc>
+          <w:tcPr>
+            <w:tcW w:w="0" w:type="auto"/>
+            <w:shd w:val="clear" w:color="auto" w:fill="DCE6F1"/>
+          </w:tcPr>
+          <w:p>
+            <w:pPr>
+              <w:pStyle w:val="Compact"/>
+              <w:spacing w:before="0" w:after="0" w:line="240" w:lineRule="auto"/>
+              <w:jc w:val="right"/>
+            </w:pPr>
+            <w:r>
+              <w:rPr>
+                <w:b/>
+                <w:sz w:val="14"/>
+              </w:rPr>
               <w:t xml:space="preserve">S2B build</w:t>
             </w:r>
           </w:p>
@@ -14069,6 +14158,24 @@
               <w:rPr>
                 <w:sz w:val="13"/>
               </w:rPr>
+              <w:t xml:space="preserve">1.000</w:t>
+            </w:r>
+          </w:p>
+        </w:tc>
+        <w:tc>
+          <w:tcPr>
+            <w:tcW w:w="0" w:type="auto"/>
+          </w:tcPr>
+          <w:p>
+            <w:pPr>
+              <w:pStyle w:val="Compact"/>
+              <w:spacing w:before="0" w:after="0" w:line="240" w:lineRule="auto"/>
+              <w:jc w:val="right"/>
+            </w:pPr>
+            <w:r>
+              <w:rPr>
+                <w:sz w:val="13"/>
+              </w:rPr>
               <w:t xml:space="preserve">2.8 s / 0.16 GB</w:t>
             </w:r>
           </w:p>
@@ -14309,6 +14416,24 @@
               <w:rPr>
                 <w:sz w:val="13"/>
               </w:rPr>
+              <w:t xml:space="preserve">1.000</w:t>
+            </w:r>
+          </w:p>
+        </w:tc>
+        <w:tc>
+          <w:tcPr>
+            <w:tcW w:w="0" w:type="auto"/>
+          </w:tcPr>
+          <w:p>
+            <w:pPr>
+              <w:pStyle w:val="Compact"/>
+              <w:spacing w:before="0" w:after="0" w:line="240" w:lineRule="auto"/>
+              <w:jc w:val="right"/>
+            </w:pPr>
+            <w:r>
+              <w:rPr>
+                <w:sz w:val="13"/>
+              </w:rPr>
               <w:t xml:space="preserve">3.2 s / 0.28 GB</w:t>
             </w:r>
           </w:p>
@@ -14549,6 +14674,24 @@
               <w:rPr>
                 <w:sz w:val="13"/>
               </w:rPr>
+              <w:t xml:space="preserve">1.000</w:t>
+            </w:r>
+          </w:p>
+        </w:tc>
+        <w:tc>
+          <w:tcPr>
+            <w:tcW w:w="0" w:type="auto"/>
+          </w:tcPr>
+          <w:p>
+            <w:pPr>
+              <w:pStyle w:val="Compact"/>
+              <w:spacing w:before="0" w:after="0" w:line="240" w:lineRule="auto"/>
+              <w:jc w:val="right"/>
+            </w:pPr>
+            <w:r>
+              <w:rPr>
+                <w:sz w:val="13"/>
+              </w:rPr>
               <w:t xml:space="preserve">1.5 s / 0.17 GB</w:t>
             </w:r>
           </w:p>
@@ -14789,6 +14932,24 @@
               <w:rPr>
                 <w:sz w:val="13"/>
               </w:rPr>
+              <w:t xml:space="preserve">1.000</w:t>
+            </w:r>
+          </w:p>
+        </w:tc>
+        <w:tc>
+          <w:tcPr>
+            <w:tcW w:w="0" w:type="auto"/>
+          </w:tcPr>
+          <w:p>
+            <w:pPr>
+              <w:pStyle w:val="Compact"/>
+              <w:spacing w:before="0" w:after="0" w:line="240" w:lineRule="auto"/>
+              <w:jc w:val="right"/>
+            </w:pPr>
+            <w:r>
+              <w:rPr>
+                <w:sz w:val="13"/>
+              </w:rPr>
               <w:t xml:space="preserve">4.3 s / 0.34 GB</w:t>
             </w:r>
           </w:p>
@@ -15029,6 +15190,24 @@
               <w:rPr>
                 <w:sz w:val="13"/>
               </w:rPr>
+              <w:t xml:space="preserve">1.000</w:t>
+            </w:r>
+          </w:p>
+        </w:tc>
+        <w:tc>
+          <w:tcPr>
+            <w:tcW w:w="0" w:type="auto"/>
+          </w:tcPr>
+          <w:p>
+            <w:pPr>
+              <w:pStyle w:val="Compact"/>
+              <w:spacing w:before="0" w:after="0" w:line="240" w:lineRule="auto"/>
+              <w:jc w:val="right"/>
+            </w:pPr>
+            <w:r>
+              <w:rPr>
+                <w:sz w:val="13"/>
+              </w:rPr>
               <w:t xml:space="preserve">0.7 s / 0.10 GB</w:t>
             </w:r>
           </w:p>
@@ -15269,6 +15448,24 @@
               <w:rPr>
                 <w:sz w:val="13"/>
               </w:rPr>
+              <w:t xml:space="preserve">1.000</w:t>
+            </w:r>
+          </w:p>
+        </w:tc>
+        <w:tc>
+          <w:tcPr>
+            <w:tcW w:w="0" w:type="auto"/>
+          </w:tcPr>
+          <w:p>
+            <w:pPr>
+              <w:pStyle w:val="Compact"/>
+              <w:spacing w:before="0" w:after="0" w:line="240" w:lineRule="auto"/>
+              <w:jc w:val="right"/>
+            </w:pPr>
+            <w:r>
+              <w:rPr>
+                <w:sz w:val="13"/>
+              </w:rPr>
               <w:t xml:space="preserve">5.1 s / 0.40 GB</w:t>
             </w:r>
           </w:p>
@@ -15509,6 +15706,24 @@
               <w:rPr>
                 <w:sz w:val="13"/>
               </w:rPr>
+              <w:t xml:space="preserve">1.000</w:t>
+            </w:r>
+          </w:p>
+        </w:tc>
+        <w:tc>
+          <w:tcPr>
+            <w:tcW w:w="0" w:type="auto"/>
+          </w:tcPr>
+          <w:p>
+            <w:pPr>
+              <w:pStyle w:val="Compact"/>
+              <w:spacing w:before="0" w:after="0" w:line="240" w:lineRule="auto"/>
+              <w:jc w:val="right"/>
+            </w:pPr>
+            <w:r>
+              <w:rPr>
+                <w:sz w:val="13"/>
+              </w:rPr>
               <w:t xml:space="preserve">5.0 s / 0.24 GB</w:t>
             </w:r>
           </w:p>
@@ -15749,6 +15964,24 @@
               <w:rPr>
                 <w:sz w:val="13"/>
               </w:rPr>
+              <w:t xml:space="preserve">1.000</w:t>
+            </w:r>
+          </w:p>
+        </w:tc>
+        <w:tc>
+          <w:tcPr>
+            <w:tcW w:w="0" w:type="auto"/>
+          </w:tcPr>
+          <w:p>
+            <w:pPr>
+              <w:pStyle w:val="Compact"/>
+              <w:spacing w:before="0" w:after="0" w:line="240" w:lineRule="auto"/>
+              <w:jc w:val="right"/>
+            </w:pPr>
+            <w:r>
+              <w:rPr>
+                <w:sz w:val="13"/>
+              </w:rPr>
               <w:t xml:space="preserve">1.6 s / 0.25 GB</w:t>
             </w:r>
           </w:p>
@@ -15989,6 +16222,24 @@
               <w:rPr>
                 <w:sz w:val="13"/>
               </w:rPr>
+              <w:t xml:space="preserve">1.000</w:t>
+            </w:r>
+          </w:p>
+        </w:tc>
+        <w:tc>
+          <w:tcPr>
+            <w:tcW w:w="0" w:type="auto"/>
+          </w:tcPr>
+          <w:p>
+            <w:pPr>
+              <w:pStyle w:val="Compact"/>
+              <w:spacing w:before="0" w:after="0" w:line="240" w:lineRule="auto"/>
+              <w:jc w:val="right"/>
+            </w:pPr>
+            <w:r>
+              <w:rPr>
+                <w:sz w:val="13"/>
+              </w:rPr>
               <w:t xml:space="preserve">1.0 s / 0.25 GB</w:t>
             </w:r>
           </w:p>
@@ -16229,6 +16480,24 @@
               <w:rPr>
                 <w:sz w:val="13"/>
               </w:rPr>
+              <w:t xml:space="preserve">1.000</w:t>
+            </w:r>
+          </w:p>
+        </w:tc>
+        <w:tc>
+          <w:tcPr>
+            <w:tcW w:w="0" w:type="auto"/>
+          </w:tcPr>
+          <w:p>
+            <w:pPr>
+              <w:pStyle w:val="Compact"/>
+              <w:spacing w:before="0" w:after="0" w:line="240" w:lineRule="auto"/>
+              <w:jc w:val="right"/>
+            </w:pPr>
+            <w:r>
+              <w:rPr>
+                <w:sz w:val="13"/>
+              </w:rPr>
               <w:t xml:space="preserve">2.3 s / 0.15 GB</w:t>
             </w:r>
           </w:p>
@@ -16469,6 +16738,24 @@
               <w:rPr>
                 <w:sz w:val="13"/>
               </w:rPr>
+              <w:t xml:space="preserve">1.000</w:t>
+            </w:r>
+          </w:p>
+        </w:tc>
+        <w:tc>
+          <w:tcPr>
+            <w:tcW w:w="0" w:type="auto"/>
+          </w:tcPr>
+          <w:p>
+            <w:pPr>
+              <w:pStyle w:val="Compact"/>
+              <w:spacing w:before="0" w:after="0" w:line="240" w:lineRule="auto"/>
+              <w:jc w:val="right"/>
+            </w:pPr>
+            <w:r>
+              <w:rPr>
+                <w:sz w:val="13"/>
+              </w:rPr>
               <w:t xml:space="preserve">1.8 s / 0.19 GB</w:t>
             </w:r>
           </w:p>
@@ -16709,6 +16996,24 @@
               <w:rPr>
                 <w:sz w:val="13"/>
               </w:rPr>
+              <w:t xml:space="preserve">1.000</w:t>
+            </w:r>
+          </w:p>
+        </w:tc>
+        <w:tc>
+          <w:tcPr>
+            <w:tcW w:w="0" w:type="auto"/>
+          </w:tcPr>
+          <w:p>
+            <w:pPr>
+              <w:pStyle w:val="Compact"/>
+              <w:spacing w:before="0" w:after="0" w:line="240" w:lineRule="auto"/>
+              <w:jc w:val="right"/>
+            </w:pPr>
+            <w:r>
+              <w:rPr>
+                <w:sz w:val="13"/>
+              </w:rPr>
               <w:t xml:space="preserve">4.2 s / 0.37 GB</w:t>
             </w:r>
           </w:p>
@@ -16949,6 +17254,24 @@
               <w:rPr>
                 <w:sz w:val="13"/>
               </w:rPr>
+              <w:t xml:space="preserve">1.000</w:t>
+            </w:r>
+          </w:p>
+        </w:tc>
+        <w:tc>
+          <w:tcPr>
+            <w:tcW w:w="0" w:type="auto"/>
+          </w:tcPr>
+          <w:p>
+            <w:pPr>
+              <w:pStyle w:val="Compact"/>
+              <w:spacing w:before="0" w:after="0" w:line="240" w:lineRule="auto"/>
+              <w:jc w:val="right"/>
+            </w:pPr>
+            <w:r>
+              <w:rPr>
+                <w:sz w:val="13"/>
+              </w:rPr>
               <w:t xml:space="preserve">1.7 s / 0.17 GB</w:t>
             </w:r>
           </w:p>
@@ -17189,6 +17512,24 @@
               <w:rPr>
                 <w:sz w:val="13"/>
               </w:rPr>
+              <w:t xml:space="preserve">0.800</w:t>
+            </w:r>
+          </w:p>
+        </w:tc>
+        <w:tc>
+          <w:tcPr>
+            <w:tcW w:w="0" w:type="auto"/>
+          </w:tcPr>
+          <w:p>
+            <w:pPr>
+              <w:pStyle w:val="Compact"/>
+              <w:spacing w:before="0" w:after="0" w:line="240" w:lineRule="auto"/>
+              <w:jc w:val="right"/>
+            </w:pPr>
+            <w:r>
+              <w:rPr>
+                <w:sz w:val="13"/>
+              </w:rPr>
               <w:t xml:space="preserve">1.6 s / 0.14 GB</w:t>
             </w:r>
           </w:p>
@@ -17412,6 +17753,24 @@
                 <w:sz w:val="13"/>
               </w:rPr>
               <w:t xml:space="preserve">0.800</w:t>
+            </w:r>
+          </w:p>
+        </w:tc>
+        <w:tc>
+          <w:tcPr>
+            <w:tcW w:w="0" w:type="auto"/>
+          </w:tcPr>
+          <w:p>
+            <w:pPr>
+              <w:pStyle w:val="Compact"/>
+              <w:spacing w:before="0" w:after="0" w:line="240" w:lineRule="auto"/>
+              <w:jc w:val="right"/>
+            </w:pPr>
+            <w:r>
+              <w:rPr>
+                <w:sz w:val="13"/>
+              </w:rPr>
+              <w:t xml:space="preserve">1.000</w:t>
             </w:r>
           </w:p>
         </w:tc>
@@ -17510,13 +17869,13 @@
           <w:b/>
           <w:bCs/>
         </w:rPr>
-        <w:t xml:space="preserve">Table S4. Failure-aware sensitivity for all 225 matched single-species entries.</w:t>
-      </w:r>
-      <w:r>
-        <w:t xml:space="preserve"> </w:t>
-      </w:r>
-      <w:r>
-        <w:t xml:space="preserve">Absent StrainScan final reports were retained and scored as zero detection. Mean paired differences use the same species-cluster bootstrap as the completed-pair analysis. Source:</w:t>
+        <w:t xml:space="preserve">Table 2. Accuracy and archived per-sample cost vs sequencing depth (single-species rerun; medians).</w:t>
+      </w:r>
+      <w:r>
+        <w:t xml:space="preserve"> </w:t>
+      </w:r>
+      <w:r>
+        <w:t xml:space="preserve">Current Strain2bScan accuracy is from</w:t>
       </w:r>
       <w:r>
         <w:t xml:space="preserve"> </w:t>
@@ -17531,7 +17890,7 @@
         <w:t xml:space="preserve"> </w:t>
       </w:r>
       <w:r>
-        <w:t xml:space="preserve">and</w:t>
+        <w:t xml:space="preserve">on the 204 completed StrainScan pairs. †StrainGE/StrainGST metrics use the separate 0.90-reference space and are not pooled across tools. Cost comes from a smaller archived same-environment emulation subset whose per-depth n values differ from the accuracy n values (Strain2bScan</w:t>
       </w:r>
       <w:r>
         <w:t xml:space="preserve"> </w:t>
@@ -17540,10 +17899,13 @@
         <w:rPr>
           <w:rStyle w:val="VerbatimChar"/>
         </w:rPr>
-        <w:t xml:space="preserve">results/strainscan_rerun/current_uncertainty_summary.tsv</w:t>
-      </w:r>
-      <w:r>
-        <w:t xml:space="preserve">.</w:t>
+        <w:t xml:space="preserve">linux/amd64</w:t>
+      </w:r>
+      <w:r>
+        <w:t xml:space="preserve"> </w:t>
+      </w:r>
+      <w:r>
+        <w:t xml:space="preserve">vs StrainScan).</w:t>
       </w:r>
     </w:p>
     <w:tbl>
@@ -17569,11 +17931,13 @@
         <w:tblLook w:firstRow="1" w:lastRow="0" w:firstColumn="0" w:lastColumn="0" w:noHBand="0" w:noVBand="0" w:val="0020"/>
       </w:tblPr>
       <w:tblGrid>
-        <w:gridCol w:w="1397"/>
-        <w:gridCol w:w="1397"/>
-        <w:gridCol w:w="1397"/>
-        <w:gridCol w:w="1863"/>
-        <w:gridCol w:w="1863"/>
+        <w:gridCol w:w="950"/>
+        <w:gridCol w:w="950"/>
+        <w:gridCol w:w="1267"/>
+        <w:gridCol w:w="1267"/>
+        <w:gridCol w:w="950"/>
+        <w:gridCol w:w="1267"/>
+        <w:gridCol w:w="1267"/>
       </w:tblGrid>
       <w:tr>
         <w:trPr>
@@ -17589,13 +17953,14 @@
             <w:pPr>
               <w:pStyle w:val="Compact"/>
               <w:spacing w:before="0" w:after="0" w:line="240" w:lineRule="auto"/>
+              <w:jc w:val="right"/>
             </w:pPr>
             <w:r>
               <w:rPr>
                 <w:b/>
-                <w:sz w:val="17"/>
-              </w:rPr>
-              <w:t xml:space="preserve">Analysis</w:t>
+                <w:sz w:val="16"/>
+              </w:rPr>
+              <w:t xml:space="preserve">Depth (×)</w:t>
             </w:r>
           </w:p>
         </w:tc>
@@ -17613,7 +17978,7 @@
             <w:r>
               <w:rPr>
                 <w:b/>
-                <w:sz w:val="17"/>
+                <w:sz w:val="16"/>
               </w:rPr>
               <w:t xml:space="preserve">n</w:t>
             </w:r>
@@ -17628,14 +17993,14 @@
             <w:pPr>
               <w:pStyle w:val="Compact"/>
               <w:spacing w:before="0" w:after="0" w:line="240" w:lineRule="auto"/>
-              <w:jc w:val="right"/>
+              <w:jc w:val="center"/>
             </w:pPr>
             <w:r>
               <w:rPr>
                 <w:b/>
-                <w:sz w:val="17"/>
-              </w:rPr>
-              <w:t xml:space="preserve">No-calls</w:t>
+                <w:sz w:val="16"/>
+              </w:rPr>
+              <w:t xml:space="preserve">S2B P/R/F1</w:t>
             </w:r>
           </w:p>
         </w:tc>
@@ -17653,9 +18018,9 @@
             <w:r>
               <w:rPr>
                 <w:b/>
-                <w:sz w:val="17"/>
-              </w:rPr>
-              <w:t xml:space="preserve">Mean recall difference (95% CI)</w:t>
+                <w:sz w:val="16"/>
+              </w:rPr>
+              <w:t xml:space="preserve">SS P/R/F1</w:t>
             </w:r>
           </w:p>
         </w:tc>
@@ -17668,14 +18033,54 @@
             <w:pPr>
               <w:pStyle w:val="Compact"/>
               <w:spacing w:before="0" w:after="0" w:line="240" w:lineRule="auto"/>
+              <w:jc w:val="right"/>
+            </w:pPr>
+            <w:r>
+              <w:rPr>
+                <w:b/>
+                <w:sz w:val="16"/>
+              </w:rPr>
+              <w:t xml:space="preserve">S2B time/mem</w:t>
+            </w:r>
+          </w:p>
+        </w:tc>
+        <w:tc>
+          <w:tcPr>
+            <w:tcW w:w="0" w:type="auto"/>
+            <w:shd w:val="clear" w:color="auto" w:fill="DCE6F1"/>
+          </w:tcPr>
+          <w:p>
+            <w:pPr>
+              <w:pStyle w:val="Compact"/>
+              <w:spacing w:before="0" w:after="0" w:line="240" w:lineRule="auto"/>
               <w:jc w:val="center"/>
             </w:pPr>
             <w:r>
               <w:rPr>
                 <w:b/>
-                <w:sz w:val="17"/>
-              </w:rPr>
-              <w:t xml:space="preserve">Mean F1 difference (95% CI)</w:t>
+                <w:sz w:val="16"/>
+              </w:rPr>
+              <w:t xml:space="preserve">Separate StrainGE P/R/F1 (0.90-space)†</w:t>
+            </w:r>
+          </w:p>
+        </w:tc>
+        <w:tc>
+          <w:tcPr>
+            <w:tcW w:w="0" w:type="auto"/>
+            <w:shd w:val="clear" w:color="auto" w:fill="DCE6F1"/>
+          </w:tcPr>
+          <w:p>
+            <w:pPr>
+              <w:pStyle w:val="Compact"/>
+              <w:spacing w:before="0" w:after="0" w:line="240" w:lineRule="auto"/>
+              <w:jc w:val="center"/>
+            </w:pPr>
+            <w:r>
+              <w:rPr>
+                <w:b/>
+                <w:sz w:val="16"/>
+              </w:rPr>
+              <w:t xml:space="preserve">SS time/mem</w:t>
             </w:r>
           </w:p>
         </w:tc>
@@ -17692,48 +18097,31 @@
             <w:pPr>
               <w:pStyle w:val="Compact"/>
               <w:spacing w:before="0" w:after="0" w:line="240" w:lineRule="auto"/>
-            </w:pPr>
-            <w:r>
-              <w:rPr>
-                <w:sz w:val="16"/>
-              </w:rPr>
-              <w:t xml:space="preserve">Completed pairs</w:t>
-            </w:r>
-          </w:p>
-        </w:tc>
-        <w:tc>
-          <w:tcPr>
-            <w:tcW w:w="0" w:type="auto"/>
-          </w:tcPr>
-          <w:p>
-            <w:pPr>
-              <w:pStyle w:val="Compact"/>
-              <w:spacing w:before="0" w:after="0" w:line="240" w:lineRule="auto"/>
-              <w:jc w:val="right"/>
-            </w:pPr>
-            <w:r>
-              <w:rPr>
-                <w:sz w:val="16"/>
-              </w:rPr>
-              <w:t xml:space="preserve">204</w:t>
-            </w:r>
-          </w:p>
-        </w:tc>
-        <w:tc>
-          <w:tcPr>
-            <w:tcW w:w="0" w:type="auto"/>
-          </w:tcPr>
-          <w:p>
-            <w:pPr>
-              <w:pStyle w:val="Compact"/>
-              <w:spacing w:before="0" w:after="0" w:line="240" w:lineRule="auto"/>
-              <w:jc w:val="right"/>
-            </w:pPr>
-            <w:r>
-              <w:rPr>
-                <w:sz w:val="16"/>
-              </w:rPr>
-              <w:t xml:space="preserve">0</w:t>
+              <w:jc w:val="right"/>
+            </w:pPr>
+            <w:r>
+              <w:rPr>
+                <w:sz w:val="15"/>
+              </w:rPr>
+              <w:t xml:space="preserve">0.5</w:t>
+            </w:r>
+          </w:p>
+        </w:tc>
+        <w:tc>
+          <w:tcPr>
+            <w:tcW w:w="0" w:type="auto"/>
+          </w:tcPr>
+          <w:p>
+            <w:pPr>
+              <w:pStyle w:val="Compact"/>
+              <w:spacing w:before="0" w:after="0" w:line="240" w:lineRule="auto"/>
+              <w:jc w:val="right"/>
+            </w:pPr>
+            <w:r>
+              <w:rPr>
+                <w:sz w:val="15"/>
+              </w:rPr>
+              <w:t xml:space="preserve">40</w:t>
             </w:r>
           </w:p>
         </w:tc>
@@ -17749,9 +18137,9 @@
             </w:pPr>
             <w:r>
               <w:rPr>
-                <w:sz w:val="16"/>
-              </w:rPr>
-              <w:t xml:space="preserve">+0.063 (−0.037 to 0.133)</w:t>
+                <w:sz w:val="15"/>
+              </w:rPr>
+              <w:t xml:space="preserve">1.000/0.600/0.708</w:t>
             </w:r>
           </w:p>
         </w:tc>
@@ -17767,9 +18155,63 @@
             </w:pPr>
             <w:r>
               <w:rPr>
-                <w:sz w:val="16"/>
-              </w:rPr>
-              <w:t xml:space="preserve">+0.005 (−0.091 to 0.069)</w:t>
+                <w:sz w:val="15"/>
+              </w:rPr>
+              <w:t xml:space="preserve">1.000/0.667/0.800</w:t>
+            </w:r>
+          </w:p>
+        </w:tc>
+        <w:tc>
+          <w:tcPr>
+            <w:tcW w:w="0" w:type="auto"/>
+          </w:tcPr>
+          <w:p>
+            <w:pPr>
+              <w:pStyle w:val="Compact"/>
+              <w:spacing w:before="0" w:after="0" w:line="240" w:lineRule="auto"/>
+              <w:jc w:val="right"/>
+            </w:pPr>
+            <w:r>
+              <w:rPr>
+                <w:sz w:val="15"/>
+              </w:rPr>
+              <w:t xml:space="preserve">1.000/1.000/1.000</w:t>
+            </w:r>
+          </w:p>
+        </w:tc>
+        <w:tc>
+          <w:tcPr>
+            <w:tcW w:w="0" w:type="auto"/>
+          </w:tcPr>
+          <w:p>
+            <w:pPr>
+              <w:pStyle w:val="Compact"/>
+              <w:spacing w:before="0" w:after="0" w:line="240" w:lineRule="auto"/>
+              <w:jc w:val="center"/>
+            </w:pPr>
+            <w:r>
+              <w:rPr>
+                <w:sz w:val="15"/>
+              </w:rPr>
+              <w:t xml:space="preserve">0.16 s / 21 MB</w:t>
+            </w:r>
+          </w:p>
+        </w:tc>
+        <w:tc>
+          <w:tcPr>
+            <w:tcW w:w="0" w:type="auto"/>
+          </w:tcPr>
+          <w:p>
+            <w:pPr>
+              <w:pStyle w:val="Compact"/>
+              <w:spacing w:before="0" w:after="0" w:line="240" w:lineRule="auto"/>
+              <w:jc w:val="center"/>
+            </w:pPr>
+            <w:r>
+              <w:rPr>
+                <w:sz w:val="15"/>
+              </w:rPr>
+              <w:t xml:space="preserve">5.30 s / 831 MB</w:t>
             </w:r>
           </w:p>
         </w:tc>
@@ -17786,48 +18228,31 @@
             <w:pPr>
               <w:pStyle w:val="Compact"/>
               <w:spacing w:before="0" w:after="0" w:line="240" w:lineRule="auto"/>
-            </w:pPr>
-            <w:r>
-              <w:rPr>
-                <w:sz w:val="16"/>
-              </w:rPr>
-              <w:t xml:space="preserve">Failure as absence</w:t>
-            </w:r>
-          </w:p>
-        </w:tc>
-        <w:tc>
-          <w:tcPr>
-            <w:tcW w:w="0" w:type="auto"/>
-          </w:tcPr>
-          <w:p>
-            <w:pPr>
-              <w:pStyle w:val="Compact"/>
-              <w:spacing w:before="0" w:after="0" w:line="240" w:lineRule="auto"/>
-              <w:jc w:val="right"/>
-            </w:pPr>
-            <w:r>
-              <w:rPr>
-                <w:sz w:val="16"/>
-              </w:rPr>
-              <w:t xml:space="preserve">225</w:t>
-            </w:r>
-          </w:p>
-        </w:tc>
-        <w:tc>
-          <w:tcPr>
-            <w:tcW w:w="0" w:type="auto"/>
-          </w:tcPr>
-          <w:p>
-            <w:pPr>
-              <w:pStyle w:val="Compact"/>
-              <w:spacing w:before="0" w:after="0" w:line="240" w:lineRule="auto"/>
-              <w:jc w:val="right"/>
-            </w:pPr>
-            <w:r>
-              <w:rPr>
-                <w:sz w:val="16"/>
-              </w:rPr>
-              <w:t xml:space="preserve">21</w:t>
+              <w:jc w:val="right"/>
+            </w:pPr>
+            <w:r>
+              <w:rPr>
+                <w:sz w:val="15"/>
+              </w:rPr>
+              <w:t xml:space="preserve">1</w:t>
+            </w:r>
+          </w:p>
+        </w:tc>
+        <w:tc>
+          <w:tcPr>
+            <w:tcW w:w="0" w:type="auto"/>
+          </w:tcPr>
+          <w:p>
+            <w:pPr>
+              <w:pStyle w:val="Compact"/>
+              <w:spacing w:before="0" w:after="0" w:line="240" w:lineRule="auto"/>
+              <w:jc w:val="right"/>
+            </w:pPr>
+            <w:r>
+              <w:rPr>
+                <w:sz w:val="15"/>
+              </w:rPr>
+              <w:t xml:space="preserve">41</w:t>
             </w:r>
           </w:p>
         </w:tc>
@@ -17843,9 +18268,9 @@
             </w:pPr>
             <w:r>
               <w:rPr>
-                <w:sz w:val="16"/>
-              </w:rPr>
-              <w:t xml:space="preserve">+0.127 (−0.020 to 0.176)</w:t>
+                <w:sz w:val="15"/>
+              </w:rPr>
+              <w:t xml:space="preserve">1.000/1.000/1.000</w:t>
             </w:r>
           </w:p>
         </w:tc>
@@ -17861,14 +18286,469 @@
             </w:pPr>
             <w:r>
               <w:rPr>
-                <w:sz w:val="16"/>
-              </w:rPr>
-              <w:t xml:space="preserve">+0.076 (−0.075 to 0.120)</w:t>
+                <w:sz w:val="15"/>
+              </w:rPr>
+              <w:t xml:space="preserve">1.000/1.000/1.000</w:t>
+            </w:r>
+          </w:p>
+        </w:tc>
+        <w:tc>
+          <w:tcPr>
+            <w:tcW w:w="0" w:type="auto"/>
+          </w:tcPr>
+          <w:p>
+            <w:pPr>
+              <w:pStyle w:val="Compact"/>
+              <w:spacing w:before="0" w:after="0" w:line="240" w:lineRule="auto"/>
+              <w:jc w:val="right"/>
+            </w:pPr>
+            <w:r>
+              <w:rPr>
+                <w:sz w:val="15"/>
+              </w:rPr>
+              <w:t xml:space="preserve">1.000/1.000/1.000</w:t>
+            </w:r>
+          </w:p>
+        </w:tc>
+        <w:tc>
+          <w:tcPr>
+            <w:tcW w:w="0" w:type="auto"/>
+          </w:tcPr>
+          <w:p>
+            <w:pPr>
+              <w:pStyle w:val="Compact"/>
+              <w:spacing w:before="0" w:after="0" w:line="240" w:lineRule="auto"/>
+              <w:jc w:val="center"/>
+            </w:pPr>
+            <w:r>
+              <w:rPr>
+                <w:sz w:val="15"/>
+              </w:rPr>
+              <w:t xml:space="preserve">0.24 s / 30 MB</w:t>
+            </w:r>
+          </w:p>
+        </w:tc>
+        <w:tc>
+          <w:tcPr>
+            <w:tcW w:w="0" w:type="auto"/>
+          </w:tcPr>
+          <w:p>
+            <w:pPr>
+              <w:pStyle w:val="Compact"/>
+              <w:spacing w:before="0" w:after="0" w:line="240" w:lineRule="auto"/>
+              <w:jc w:val="center"/>
+            </w:pPr>
+            <w:r>
+              <w:rPr>
+                <w:sz w:val="15"/>
+              </w:rPr>
+              <w:t xml:space="preserve">3.48 s / 831 MB</w:t>
+            </w:r>
+          </w:p>
+        </w:tc>
+      </w:tr>
+      <w:tr>
+        <w:trPr>
+          <w:cantSplit/>
+        </w:trPr>
+        <w:tc>
+          <w:tcPr>
+            <w:tcW w:w="0" w:type="auto"/>
+          </w:tcPr>
+          <w:p>
+            <w:pPr>
+              <w:pStyle w:val="Compact"/>
+              <w:spacing w:before="0" w:after="0" w:line="240" w:lineRule="auto"/>
+              <w:jc w:val="right"/>
+            </w:pPr>
+            <w:r>
+              <w:rPr>
+                <w:sz w:val="15"/>
+              </w:rPr>
+              <w:t xml:space="preserve">3</w:t>
+            </w:r>
+          </w:p>
+        </w:tc>
+        <w:tc>
+          <w:tcPr>
+            <w:tcW w:w="0" w:type="auto"/>
+          </w:tcPr>
+          <w:p>
+            <w:pPr>
+              <w:pStyle w:val="Compact"/>
+              <w:spacing w:before="0" w:after="0" w:line="240" w:lineRule="auto"/>
+              <w:jc w:val="right"/>
+            </w:pPr>
+            <w:r>
+              <w:rPr>
+                <w:sz w:val="15"/>
+              </w:rPr>
+              <w:t xml:space="preserve">41</w:t>
+            </w:r>
+          </w:p>
+        </w:tc>
+        <w:tc>
+          <w:tcPr>
+            <w:tcW w:w="0" w:type="auto"/>
+          </w:tcPr>
+          <w:p>
+            <w:pPr>
+              <w:pStyle w:val="Compact"/>
+              <w:spacing w:before="0" w:after="0" w:line="240" w:lineRule="auto"/>
+              <w:jc w:val="center"/>
+            </w:pPr>
+            <w:r>
+              <w:rPr>
+                <w:sz w:val="15"/>
+              </w:rPr>
+              <w:t xml:space="preserve">1.000/1.000/1.000</w:t>
+            </w:r>
+          </w:p>
+        </w:tc>
+        <w:tc>
+          <w:tcPr>
+            <w:tcW w:w="0" w:type="auto"/>
+          </w:tcPr>
+          <w:p>
+            <w:pPr>
+              <w:pStyle w:val="Compact"/>
+              <w:spacing w:before="0" w:after="0" w:line="240" w:lineRule="auto"/>
+              <w:jc w:val="center"/>
+            </w:pPr>
+            <w:r>
+              <w:rPr>
+                <w:sz w:val="15"/>
+              </w:rPr>
+              <w:t xml:space="preserve">1.000/0.600/0.750</w:t>
+            </w:r>
+          </w:p>
+        </w:tc>
+        <w:tc>
+          <w:tcPr>
+            <w:tcW w:w="0" w:type="auto"/>
+          </w:tcPr>
+          <w:p>
+            <w:pPr>
+              <w:pStyle w:val="Compact"/>
+              <w:spacing w:before="0" w:after="0" w:line="240" w:lineRule="auto"/>
+              <w:jc w:val="right"/>
+            </w:pPr>
+            <w:r>
+              <w:rPr>
+                <w:sz w:val="15"/>
+              </w:rPr>
+              <w:t xml:space="preserve">1.000/1.000/1.000</w:t>
+            </w:r>
+          </w:p>
+        </w:tc>
+        <w:tc>
+          <w:tcPr>
+            <w:tcW w:w="0" w:type="auto"/>
+          </w:tcPr>
+          <w:p>
+            <w:pPr>
+              <w:pStyle w:val="Compact"/>
+              <w:spacing w:before="0" w:after="0" w:line="240" w:lineRule="auto"/>
+              <w:jc w:val="center"/>
+            </w:pPr>
+            <w:r>
+              <w:rPr>
+                <w:sz w:val="15"/>
+              </w:rPr>
+              <w:t xml:space="preserve">0.56 s / 60 MB</w:t>
+            </w:r>
+          </w:p>
+        </w:tc>
+        <w:tc>
+          <w:tcPr>
+            <w:tcW w:w="0" w:type="auto"/>
+          </w:tcPr>
+          <w:p>
+            <w:pPr>
+              <w:pStyle w:val="Compact"/>
+              <w:spacing w:before="0" w:after="0" w:line="240" w:lineRule="auto"/>
+              <w:jc w:val="center"/>
+            </w:pPr>
+            <w:r>
+              <w:rPr>
+                <w:sz w:val="15"/>
+              </w:rPr>
+              <w:t xml:space="preserve">4.17 s / 831 MB</w:t>
+            </w:r>
+          </w:p>
+        </w:tc>
+      </w:tr>
+      <w:tr>
+        <w:trPr>
+          <w:cantSplit/>
+        </w:trPr>
+        <w:tc>
+          <w:tcPr>
+            <w:tcW w:w="0" w:type="auto"/>
+          </w:tcPr>
+          <w:p>
+            <w:pPr>
+              <w:pStyle w:val="Compact"/>
+              <w:spacing w:before="0" w:after="0" w:line="240" w:lineRule="auto"/>
+              <w:jc w:val="right"/>
+            </w:pPr>
+            <w:r>
+              <w:rPr>
+                <w:sz w:val="15"/>
+              </w:rPr>
+              <w:t xml:space="preserve">5</w:t>
+            </w:r>
+          </w:p>
+        </w:tc>
+        <w:tc>
+          <w:tcPr>
+            <w:tcW w:w="0" w:type="auto"/>
+          </w:tcPr>
+          <w:p>
+            <w:pPr>
+              <w:pStyle w:val="Compact"/>
+              <w:spacing w:before="0" w:after="0" w:line="240" w:lineRule="auto"/>
+              <w:jc w:val="right"/>
+            </w:pPr>
+            <w:r>
+              <w:rPr>
+                <w:sz w:val="15"/>
+              </w:rPr>
+              <w:t xml:space="preserve">41</w:t>
+            </w:r>
+          </w:p>
+        </w:tc>
+        <w:tc>
+          <w:tcPr>
+            <w:tcW w:w="0" w:type="auto"/>
+          </w:tcPr>
+          <w:p>
+            <w:pPr>
+              <w:pStyle w:val="Compact"/>
+              <w:spacing w:before="0" w:after="0" w:line="240" w:lineRule="auto"/>
+              <w:jc w:val="center"/>
+            </w:pPr>
+            <w:r>
+              <w:rPr>
+                <w:sz w:val="15"/>
+              </w:rPr>
+              <w:t xml:space="preserve">1.000/1.000/1.000</w:t>
+            </w:r>
+          </w:p>
+        </w:tc>
+        <w:tc>
+          <w:tcPr>
+            <w:tcW w:w="0" w:type="auto"/>
+          </w:tcPr>
+          <w:p>
+            <w:pPr>
+              <w:pStyle w:val="Compact"/>
+              <w:spacing w:before="0" w:after="0" w:line="240" w:lineRule="auto"/>
+              <w:jc w:val="center"/>
+            </w:pPr>
+            <w:r>
+              <w:rPr>
+                <w:sz w:val="15"/>
+              </w:rPr>
+              <w:t xml:space="preserve">1.000/0.667/0.800</w:t>
+            </w:r>
+          </w:p>
+        </w:tc>
+        <w:tc>
+          <w:tcPr>
+            <w:tcW w:w="0" w:type="auto"/>
+          </w:tcPr>
+          <w:p>
+            <w:pPr>
+              <w:pStyle w:val="Compact"/>
+              <w:spacing w:before="0" w:after="0" w:line="240" w:lineRule="auto"/>
+              <w:jc w:val="right"/>
+            </w:pPr>
+            <w:r>
+              <w:rPr>
+                <w:sz w:val="15"/>
+              </w:rPr>
+              <w:t xml:space="preserve">1.000/1.000/1.000</w:t>
+            </w:r>
+          </w:p>
+        </w:tc>
+        <w:tc>
+          <w:tcPr>
+            <w:tcW w:w="0" w:type="auto"/>
+          </w:tcPr>
+          <w:p>
+            <w:pPr>
+              <w:pStyle w:val="Compact"/>
+              <w:spacing w:before="0" w:after="0" w:line="240" w:lineRule="auto"/>
+              <w:jc w:val="center"/>
+            </w:pPr>
+            <w:r>
+              <w:rPr>
+                <w:sz w:val="15"/>
+              </w:rPr>
+              <w:t xml:space="preserve">0.89 s / 91 MB</w:t>
+            </w:r>
+          </w:p>
+        </w:tc>
+        <w:tc>
+          <w:tcPr>
+            <w:tcW w:w="0" w:type="auto"/>
+          </w:tcPr>
+          <w:p>
+            <w:pPr>
+              <w:pStyle w:val="Compact"/>
+              <w:spacing w:before="0" w:after="0" w:line="240" w:lineRule="auto"/>
+              <w:jc w:val="center"/>
+            </w:pPr>
+            <w:r>
+              <w:rPr>
+                <w:sz w:val="15"/>
+              </w:rPr>
+              <w:t xml:space="preserve">4.79 s / 831 MB</w:t>
+            </w:r>
+          </w:p>
+        </w:tc>
+      </w:tr>
+      <w:tr>
+        <w:trPr>
+          <w:cantSplit/>
+        </w:trPr>
+        <w:tc>
+          <w:tcPr>
+            <w:tcW w:w="0" w:type="auto"/>
+          </w:tcPr>
+          <w:p>
+            <w:pPr>
+              <w:pStyle w:val="Compact"/>
+              <w:spacing w:before="0" w:after="0" w:line="240" w:lineRule="auto"/>
+              <w:jc w:val="right"/>
+            </w:pPr>
+            <w:r>
+              <w:rPr>
+                <w:sz w:val="15"/>
+              </w:rPr>
+              <w:t xml:space="preserve">10</w:t>
+            </w:r>
+          </w:p>
+        </w:tc>
+        <w:tc>
+          <w:tcPr>
+            <w:tcW w:w="0" w:type="auto"/>
+          </w:tcPr>
+          <w:p>
+            <w:pPr>
+              <w:pStyle w:val="Compact"/>
+              <w:spacing w:before="0" w:after="0" w:line="240" w:lineRule="auto"/>
+              <w:jc w:val="right"/>
+            </w:pPr>
+            <w:r>
+              <w:rPr>
+                <w:sz w:val="15"/>
+              </w:rPr>
+              <w:t xml:space="preserve">41</w:t>
+            </w:r>
+          </w:p>
+        </w:tc>
+        <w:tc>
+          <w:tcPr>
+            <w:tcW w:w="0" w:type="auto"/>
+          </w:tcPr>
+          <w:p>
+            <w:pPr>
+              <w:pStyle w:val="Compact"/>
+              <w:spacing w:before="0" w:after="0" w:line="240" w:lineRule="auto"/>
+              <w:jc w:val="center"/>
+            </w:pPr>
+            <w:r>
+              <w:rPr>
+                <w:sz w:val="15"/>
+              </w:rPr>
+              <w:t xml:space="preserve">1.000/1.000/1.000</w:t>
+            </w:r>
+          </w:p>
+        </w:tc>
+        <w:tc>
+          <w:tcPr>
+            <w:tcW w:w="0" w:type="auto"/>
+          </w:tcPr>
+          <w:p>
+            <w:pPr>
+              <w:pStyle w:val="Compact"/>
+              <w:spacing w:before="0" w:after="0" w:line="240" w:lineRule="auto"/>
+              <w:jc w:val="center"/>
+            </w:pPr>
+            <w:r>
+              <w:rPr>
+                <w:sz w:val="15"/>
+              </w:rPr>
+              <w:t xml:space="preserve">1.000/1.000/1.000</w:t>
+            </w:r>
+          </w:p>
+        </w:tc>
+        <w:tc>
+          <w:tcPr>
+            <w:tcW w:w="0" w:type="auto"/>
+          </w:tcPr>
+          <w:p>
+            <w:pPr>
+              <w:pStyle w:val="Compact"/>
+              <w:spacing w:before="0" w:after="0" w:line="240" w:lineRule="auto"/>
+              <w:jc w:val="right"/>
+            </w:pPr>
+            <w:r>
+              <w:rPr>
+                <w:sz w:val="15"/>
+              </w:rPr>
+              <w:t xml:space="preserve">1.000/1.000/1.000</w:t>
+            </w:r>
+          </w:p>
+        </w:tc>
+        <w:tc>
+          <w:tcPr>
+            <w:tcW w:w="0" w:type="auto"/>
+          </w:tcPr>
+          <w:p>
+            <w:pPr>
+              <w:pStyle w:val="Compact"/>
+              <w:spacing w:before="0" w:after="0" w:line="240" w:lineRule="auto"/>
+              <w:jc w:val="center"/>
+            </w:pPr>
+            <w:r>
+              <w:rPr>
+                <w:sz w:val="15"/>
+              </w:rPr>
+              <w:t xml:space="preserve">1.66 s / 161 MB</w:t>
+            </w:r>
+          </w:p>
+        </w:tc>
+        <w:tc>
+          <w:tcPr>
+            <w:tcW w:w="0" w:type="auto"/>
+          </w:tcPr>
+          <w:p>
+            <w:pPr>
+              <w:pStyle w:val="Compact"/>
+              <w:spacing w:before="0" w:after="0" w:line="240" w:lineRule="auto"/>
+              <w:jc w:val="center"/>
+            </w:pPr>
+            <w:r>
+              <w:rPr>
+                <w:sz w:val="15"/>
+              </w:rPr>
+              <w:t xml:space="preserve">6.92 s / 832 MB</w:t>
             </w:r>
           </w:p>
         </w:tc>
       </w:tr>
     </w:tbl>
+    <w:p>
+      <w:pPr>
+        <w:pStyle w:val="BodyText"/>
+      </w:pPr>
+      <w:r>
+        <w:t xml:space="preserve">Strain2bScan reached median recall 1.0 from 1× onward; StrainScan was non-monotonic and did not exceed 0.800 median F1 at 0.5× or intermediate depths. The depth table aggregates heterogeneous strain mixtures and is not a causal depth-onset estimate.</w:t>
+      </w:r>
+    </w:p>
     <w:p>
       <w:r>
         <w:br w:type="page"/>
@@ -17883,13 +18763,13 @@
           <w:b/>
           <w:bCs/>
         </w:rPr>
-        <w:t xml:space="preserve">Table 2. Accuracy and archived per-sample cost vs sequencing depth (single-species rerun; medians).</w:t>
-      </w:r>
-      <w:r>
-        <w:t xml:space="preserve"> </w:t>
-      </w:r>
-      <w:r>
-        <w:t xml:space="preserve">Current Strain2bScan accuracy is from</w:t>
+        <w:t xml:space="preserve">Table 3. Multi-species community accuracy (reproducible rerun; medians) and archived profiling cost.</w:t>
+      </w:r>
+      <w:r>
+        <w:t xml:space="preserve"> </w:t>
+      </w:r>
+      <w:r>
+        <w:t xml:space="preserve">Current Strain2bScan values are from</w:t>
       </w:r>
       <w:r>
         <w:t xml:space="preserve"> </w:t>
@@ -17898,28 +18778,10 @@
         <w:rPr>
           <w:rStyle w:val="VerbatimChar"/>
         </w:rPr>
-        <w:t xml:space="preserve">results/strainscan_rerun/current_single_persample.tsv</w:t>
-      </w:r>
-      <w:r>
-        <w:t xml:space="preserve"> </w:t>
-      </w:r>
-      <w:r>
-        <w:t xml:space="preserve">on the 204 completed StrainScan pairs. Cost comes from the archived same-environment emulation subset (Strain2bScan</w:t>
-      </w:r>
-      <w:r>
-        <w:t xml:space="preserve"> </w:t>
-      </w:r>
-      <w:r>
-        <w:rPr>
-          <w:rStyle w:val="VerbatimChar"/>
-        </w:rPr>
-        <w:t xml:space="preserve">linux/amd64</w:t>
-      </w:r>
-      <w:r>
-        <w:t xml:space="preserve"> </w:t>
-      </w:r>
-      <w:r>
-        <w:t xml:space="preserve">vs StrainScan).</w:t>
+        <w:t xml:space="preserve">results/strainscan_rerun/current_multi_persample.tsv</w:t>
+      </w:r>
+      <w:r>
+        <w:t xml:space="preserve">. †StrainGE/StrainGST metrics use the separate 0.90-reference space and are not pooled across tools. Four samples per depth. Strain2bScan profiles each community in one digest-once pass; StrainScan has no multi-species mode, so archived cost is the sum over per-species runs.</w:t>
       </w:r>
     </w:p>
     <w:tbl>
@@ -17945,12 +18807,12 @@
         <w:tblLook w:firstRow="1" w:lastRow="0" w:firstColumn="0" w:lastColumn="0" w:noHBand="0" w:noVBand="0" w:val="0020"/>
       </w:tblPr>
       <w:tblGrid>
-        <w:gridCol w:w="1080"/>
-        <w:gridCol w:w="1080"/>
-        <w:gridCol w:w="1440"/>
-        <w:gridCol w:w="1440"/>
-        <w:gridCol w:w="1440"/>
-        <w:gridCol w:w="1440"/>
+        <w:gridCol w:w="1033"/>
+        <w:gridCol w:w="1377"/>
+        <w:gridCol w:w="1377"/>
+        <w:gridCol w:w="1377"/>
+        <w:gridCol w:w="1377"/>
+        <w:gridCol w:w="1377"/>
       </w:tblGrid>
       <w:tr>
         <w:trPr>
@@ -17966,14 +18828,13 @@
             <w:pPr>
               <w:pStyle w:val="Compact"/>
               <w:spacing w:before="0" w:after="0" w:line="240" w:lineRule="auto"/>
-              <w:jc w:val="right"/>
             </w:pPr>
             <w:r>
               <w:rPr>
                 <w:b/>
                 <w:sz w:val="17"/>
               </w:rPr>
-              <w:t xml:space="preserve">Depth (×)</w:t>
+              <w:t xml:space="preserve">Community depth</w:t>
             </w:r>
           </w:p>
         </w:tc>
@@ -17986,14 +18847,14 @@
             <w:pPr>
               <w:pStyle w:val="Compact"/>
               <w:spacing w:before="0" w:after="0" w:line="240" w:lineRule="auto"/>
-              <w:jc w:val="right"/>
+              <w:jc w:val="center"/>
             </w:pPr>
             <w:r>
               <w:rPr>
                 <w:b/>
                 <w:sz w:val="17"/>
               </w:rPr>
-              <w:t xml:space="preserve">n</w:t>
+              <w:t xml:space="preserve">S2B P/R/F1</w:t>
             </w:r>
           </w:p>
         </w:tc>
@@ -18013,7 +18874,7 @@
                 <w:b/>
                 <w:sz w:val="17"/>
               </w:rPr>
-              <w:t xml:space="preserve">S2B P/R/F1</w:t>
+              <w:t xml:space="preserve">SS P/R/F1</w:t>
             </w:r>
           </w:p>
         </w:tc>
@@ -18033,7 +18894,7 @@
                 <w:b/>
                 <w:sz w:val="17"/>
               </w:rPr>
-              <w:t xml:space="preserve">SS P/R/F1</w:t>
+              <w:t xml:space="preserve">S2B time/mem</w:t>
             </w:r>
           </w:p>
         </w:tc>
@@ -18053,7 +18914,7 @@
                 <w:b/>
                 <w:sz w:val="17"/>
               </w:rPr>
-              <w:t xml:space="preserve">S2B time/mem</w:t>
+              <w:t xml:space="preserve">Separate StrainGE P/R/F1 (0.90-space)†</w:t>
             </w:r>
           </w:p>
         </w:tc>
@@ -18090,31 +18951,30 @@
             <w:pPr>
               <w:pStyle w:val="Compact"/>
               <w:spacing w:before="0" w:after="0" w:line="240" w:lineRule="auto"/>
-              <w:jc w:val="right"/>
             </w:pPr>
             <w:r>
               <w:rPr>
                 <w:sz w:val="16"/>
               </w:rPr>
-              <w:t xml:space="preserve">0.5</w:t>
-            </w:r>
-          </w:p>
-        </w:tc>
-        <w:tc>
-          <w:tcPr>
-            <w:tcW w:w="0" w:type="auto"/>
-          </w:tcPr>
-          <w:p>
-            <w:pPr>
-              <w:pStyle w:val="Compact"/>
-              <w:spacing w:before="0" w:after="0" w:line="240" w:lineRule="auto"/>
-              <w:jc w:val="right"/>
+              <w:t xml:space="preserve">low</w:t>
+            </w:r>
+          </w:p>
+        </w:tc>
+        <w:tc>
+          <w:tcPr>
+            <w:tcW w:w="0" w:type="auto"/>
+          </w:tcPr>
+          <w:p>
+            <w:pPr>
+              <w:pStyle w:val="Compact"/>
+              <w:spacing w:before="0" w:after="0" w:line="240" w:lineRule="auto"/>
+              <w:jc w:val="center"/>
             </w:pPr>
             <w:r>
               <w:rPr>
                 <w:sz w:val="16"/>
               </w:rPr>
-              <w:t xml:space="preserve">40</w:t>
+              <w:t xml:space="preserve">0.748/0.667/0.699</w:t>
             </w:r>
           </w:p>
         </w:tc>
@@ -18132,7 +18992,7 @@
               <w:rPr>
                 <w:sz w:val="16"/>
               </w:rPr>
-              <w:t xml:space="preserve">1.000/0.600/0.708</w:t>
+              <w:t xml:space="preserve">0.938/0.702/0.798</w:t>
             </w:r>
           </w:p>
         </w:tc>
@@ -18150,7 +19010,7 @@
               <w:rPr>
                 <w:sz w:val="16"/>
               </w:rPr>
-              <w:t xml:space="preserve">1.000/0.667/0.800</w:t>
+              <w:t xml:space="preserve">0.918/1.000/0.944</w:t>
             </w:r>
           </w:p>
         </w:tc>
@@ -18168,7 +19028,7 @@
               <w:rPr>
                 <w:sz w:val="16"/>
               </w:rPr>
-              <w:t xml:space="preserve">0.16 s / 21 MB</w:t>
+              <w:t xml:space="preserve">1.0 s / 311 MB</w:t>
             </w:r>
           </w:p>
         </w:tc>
@@ -18186,7 +19046,7 @@
               <w:rPr>
                 <w:sz w:val="16"/>
               </w:rPr>
-              <w:t xml:space="preserve">5.30 s / 831 MB</w:t>
+              <w:t xml:space="preserve">100 s / 1112 MB</w:t>
             </w:r>
           </w:p>
         </w:tc>
@@ -18203,31 +19063,30 @@
             <w:pPr>
               <w:pStyle w:val="Compact"/>
               <w:spacing w:before="0" w:after="0" w:line="240" w:lineRule="auto"/>
-              <w:jc w:val="right"/>
             </w:pPr>
             <w:r>
               <w:rPr>
                 <w:sz w:val="16"/>
               </w:rPr>
-              <w:t xml:space="preserve">1</w:t>
-            </w:r>
-          </w:p>
-        </w:tc>
-        <w:tc>
-          <w:tcPr>
-            <w:tcW w:w="0" w:type="auto"/>
-          </w:tcPr>
-          <w:p>
-            <w:pPr>
-              <w:pStyle w:val="Compact"/>
-              <w:spacing w:before="0" w:after="0" w:line="240" w:lineRule="auto"/>
-              <w:jc w:val="right"/>
+              <w:t xml:space="preserve">med</w:t>
+            </w:r>
+          </w:p>
+        </w:tc>
+        <w:tc>
+          <w:tcPr>
+            <w:tcW w:w="0" w:type="auto"/>
+          </w:tcPr>
+          <w:p>
+            <w:pPr>
+              <w:pStyle w:val="Compact"/>
+              <w:spacing w:before="0" w:after="0" w:line="240" w:lineRule="auto"/>
+              <w:jc w:val="center"/>
             </w:pPr>
             <w:r>
               <w:rPr>
                 <w:sz w:val="16"/>
               </w:rPr>
-              <w:t xml:space="preserve">41</w:t>
+              <w:t xml:space="preserve">0.838/0.838/0.837</w:t>
             </w:r>
           </w:p>
         </w:tc>
@@ -18245,7 +19104,7 @@
               <w:rPr>
                 <w:sz w:val="16"/>
               </w:rPr>
-              <w:t xml:space="preserve">1.000/1.000/1.000</w:t>
+              <w:t xml:space="preserve">0.954/0.903/0.927</w:t>
             </w:r>
           </w:p>
         </w:tc>
@@ -18263,7 +19122,7 @@
               <w:rPr>
                 <w:sz w:val="16"/>
               </w:rPr>
-              <w:t xml:space="preserve">1.000/1.000/1.000</w:t>
+              <w:t xml:space="preserve">0.901/1.000/0.934</w:t>
             </w:r>
           </w:p>
         </w:tc>
@@ -18281,7 +19140,7 @@
               <w:rPr>
                 <w:sz w:val="16"/>
               </w:rPr>
-              <w:t xml:space="preserve">0.24 s / 30 MB</w:t>
+              <w:t xml:space="preserve">4.3 s / 670 MB</w:t>
             </w:r>
           </w:p>
         </w:tc>
@@ -18299,7 +19158,7 @@
               <w:rPr>
                 <w:sz w:val="16"/>
               </w:rPr>
-              <w:t xml:space="preserve">3.48 s / 831 MB</w:t>
+              <w:t xml:space="preserve">228 s / 1696 MB</w:t>
             </w:r>
           </w:p>
         </w:tc>
@@ -18316,31 +19175,30 @@
             <w:pPr>
               <w:pStyle w:val="Compact"/>
               <w:spacing w:before="0" w:after="0" w:line="240" w:lineRule="auto"/>
-              <w:jc w:val="right"/>
             </w:pPr>
             <w:r>
               <w:rPr>
                 <w:sz w:val="16"/>
               </w:rPr>
-              <w:t xml:space="preserve">3</w:t>
-            </w:r>
-          </w:p>
-        </w:tc>
-        <w:tc>
-          <w:tcPr>
-            <w:tcW w:w="0" w:type="auto"/>
-          </w:tcPr>
-          <w:p>
-            <w:pPr>
-              <w:pStyle w:val="Compact"/>
-              <w:spacing w:before="0" w:after="0" w:line="240" w:lineRule="auto"/>
-              <w:jc w:val="right"/>
+              <w:t xml:space="preserve">high</w:t>
+            </w:r>
+          </w:p>
+        </w:tc>
+        <w:tc>
+          <w:tcPr>
+            <w:tcW w:w="0" w:type="auto"/>
+          </w:tcPr>
+          <w:p>
+            <w:pPr>
+              <w:pStyle w:val="Compact"/>
+              <w:spacing w:before="0" w:after="0" w:line="240" w:lineRule="auto"/>
+              <w:jc w:val="center"/>
             </w:pPr>
             <w:r>
               <w:rPr>
                 <w:sz w:val="16"/>
               </w:rPr>
-              <w:t xml:space="preserve">41</w:t>
+              <w:t xml:space="preserve">0.806/0.806/0.806</w:t>
             </w:r>
           </w:p>
         </w:tc>
@@ -18358,7 +19216,7 @@
               <w:rPr>
                 <w:sz w:val="16"/>
               </w:rPr>
-              <w:t xml:space="preserve">1.000/1.000/1.000</w:t>
+              <w:t xml:space="preserve">0.972/0.958/0.965</w:t>
             </w:r>
           </w:p>
         </w:tc>
@@ -18376,693 +19234,7 @@
               <w:rPr>
                 <w:sz w:val="16"/>
               </w:rPr>
-              <w:t xml:space="preserve">1.000/0.600/0.750</w:t>
-            </w:r>
-          </w:p>
-        </w:tc>
-        <w:tc>
-          <w:tcPr>
-            <w:tcW w:w="0" w:type="auto"/>
-          </w:tcPr>
-          <w:p>
-            <w:pPr>
-              <w:pStyle w:val="Compact"/>
-              <w:spacing w:before="0" w:after="0" w:line="240" w:lineRule="auto"/>
-              <w:jc w:val="center"/>
-            </w:pPr>
-            <w:r>
-              <w:rPr>
-                <w:sz w:val="16"/>
-              </w:rPr>
-              <w:t xml:space="preserve">0.56 s / 60 MB</w:t>
-            </w:r>
-          </w:p>
-        </w:tc>
-        <w:tc>
-          <w:tcPr>
-            <w:tcW w:w="0" w:type="auto"/>
-          </w:tcPr>
-          <w:p>
-            <w:pPr>
-              <w:pStyle w:val="Compact"/>
-              <w:spacing w:before="0" w:after="0" w:line="240" w:lineRule="auto"/>
-              <w:jc w:val="center"/>
-            </w:pPr>
-            <w:r>
-              <w:rPr>
-                <w:sz w:val="16"/>
-              </w:rPr>
-              <w:t xml:space="preserve">4.17 s / 831 MB</w:t>
-            </w:r>
-          </w:p>
-        </w:tc>
-      </w:tr>
-      <w:tr>
-        <w:trPr>
-          <w:cantSplit/>
-        </w:trPr>
-        <w:tc>
-          <w:tcPr>
-            <w:tcW w:w="0" w:type="auto"/>
-          </w:tcPr>
-          <w:p>
-            <w:pPr>
-              <w:pStyle w:val="Compact"/>
-              <w:spacing w:before="0" w:after="0" w:line="240" w:lineRule="auto"/>
-              <w:jc w:val="right"/>
-            </w:pPr>
-            <w:r>
-              <w:rPr>
-                <w:sz w:val="16"/>
-              </w:rPr>
-              <w:t xml:space="preserve">5</w:t>
-            </w:r>
-          </w:p>
-        </w:tc>
-        <w:tc>
-          <w:tcPr>
-            <w:tcW w:w="0" w:type="auto"/>
-          </w:tcPr>
-          <w:p>
-            <w:pPr>
-              <w:pStyle w:val="Compact"/>
-              <w:spacing w:before="0" w:after="0" w:line="240" w:lineRule="auto"/>
-              <w:jc w:val="right"/>
-            </w:pPr>
-            <w:r>
-              <w:rPr>
-                <w:sz w:val="16"/>
-              </w:rPr>
-              <w:t xml:space="preserve">41</w:t>
-            </w:r>
-          </w:p>
-        </w:tc>
-        <w:tc>
-          <w:tcPr>
-            <w:tcW w:w="0" w:type="auto"/>
-          </w:tcPr>
-          <w:p>
-            <w:pPr>
-              <w:pStyle w:val="Compact"/>
-              <w:spacing w:before="0" w:after="0" w:line="240" w:lineRule="auto"/>
-              <w:jc w:val="center"/>
-            </w:pPr>
-            <w:r>
-              <w:rPr>
-                <w:sz w:val="16"/>
-              </w:rPr>
-              <w:t xml:space="preserve">1.000/1.000/1.000</w:t>
-            </w:r>
-          </w:p>
-        </w:tc>
-        <w:tc>
-          <w:tcPr>
-            <w:tcW w:w="0" w:type="auto"/>
-          </w:tcPr>
-          <w:p>
-            <w:pPr>
-              <w:pStyle w:val="Compact"/>
-              <w:spacing w:before="0" w:after="0" w:line="240" w:lineRule="auto"/>
-              <w:jc w:val="center"/>
-            </w:pPr>
-            <w:r>
-              <w:rPr>
-                <w:sz w:val="16"/>
-              </w:rPr>
-              <w:t xml:space="preserve">1.000/0.667/0.800</w:t>
-            </w:r>
-          </w:p>
-        </w:tc>
-        <w:tc>
-          <w:tcPr>
-            <w:tcW w:w="0" w:type="auto"/>
-          </w:tcPr>
-          <w:p>
-            <w:pPr>
-              <w:pStyle w:val="Compact"/>
-              <w:spacing w:before="0" w:after="0" w:line="240" w:lineRule="auto"/>
-              <w:jc w:val="center"/>
-            </w:pPr>
-            <w:r>
-              <w:rPr>
-                <w:sz w:val="16"/>
-              </w:rPr>
-              <w:t xml:space="preserve">0.89 s / 91 MB</w:t>
-            </w:r>
-          </w:p>
-        </w:tc>
-        <w:tc>
-          <w:tcPr>
-            <w:tcW w:w="0" w:type="auto"/>
-          </w:tcPr>
-          <w:p>
-            <w:pPr>
-              <w:pStyle w:val="Compact"/>
-              <w:spacing w:before="0" w:after="0" w:line="240" w:lineRule="auto"/>
-              <w:jc w:val="center"/>
-            </w:pPr>
-            <w:r>
-              <w:rPr>
-                <w:sz w:val="16"/>
-              </w:rPr>
-              <w:t xml:space="preserve">4.79 s / 831 MB</w:t>
-            </w:r>
-          </w:p>
-        </w:tc>
-      </w:tr>
-      <w:tr>
-        <w:trPr>
-          <w:cantSplit/>
-        </w:trPr>
-        <w:tc>
-          <w:tcPr>
-            <w:tcW w:w="0" w:type="auto"/>
-          </w:tcPr>
-          <w:p>
-            <w:pPr>
-              <w:pStyle w:val="Compact"/>
-              <w:spacing w:before="0" w:after="0" w:line="240" w:lineRule="auto"/>
-              <w:jc w:val="right"/>
-            </w:pPr>
-            <w:r>
-              <w:rPr>
-                <w:sz w:val="16"/>
-              </w:rPr>
-              <w:t xml:space="preserve">10</w:t>
-            </w:r>
-          </w:p>
-        </w:tc>
-        <w:tc>
-          <w:tcPr>
-            <w:tcW w:w="0" w:type="auto"/>
-          </w:tcPr>
-          <w:p>
-            <w:pPr>
-              <w:pStyle w:val="Compact"/>
-              <w:spacing w:before="0" w:after="0" w:line="240" w:lineRule="auto"/>
-              <w:jc w:val="right"/>
-            </w:pPr>
-            <w:r>
-              <w:rPr>
-                <w:sz w:val="16"/>
-              </w:rPr>
-              <w:t xml:space="preserve">41</w:t>
-            </w:r>
-          </w:p>
-        </w:tc>
-        <w:tc>
-          <w:tcPr>
-            <w:tcW w:w="0" w:type="auto"/>
-          </w:tcPr>
-          <w:p>
-            <w:pPr>
-              <w:pStyle w:val="Compact"/>
-              <w:spacing w:before="0" w:after="0" w:line="240" w:lineRule="auto"/>
-              <w:jc w:val="center"/>
-            </w:pPr>
-            <w:r>
-              <w:rPr>
-                <w:sz w:val="16"/>
-              </w:rPr>
-              <w:t xml:space="preserve">1.000/1.000/1.000</w:t>
-            </w:r>
-          </w:p>
-        </w:tc>
-        <w:tc>
-          <w:tcPr>
-            <w:tcW w:w="0" w:type="auto"/>
-          </w:tcPr>
-          <w:p>
-            <w:pPr>
-              <w:pStyle w:val="Compact"/>
-              <w:spacing w:before="0" w:after="0" w:line="240" w:lineRule="auto"/>
-              <w:jc w:val="center"/>
-            </w:pPr>
-            <w:r>
-              <w:rPr>
-                <w:sz w:val="16"/>
-              </w:rPr>
-              <w:t xml:space="preserve">1.000/1.000/1.000</w:t>
-            </w:r>
-          </w:p>
-        </w:tc>
-        <w:tc>
-          <w:tcPr>
-            <w:tcW w:w="0" w:type="auto"/>
-          </w:tcPr>
-          <w:p>
-            <w:pPr>
-              <w:pStyle w:val="Compact"/>
-              <w:spacing w:before="0" w:after="0" w:line="240" w:lineRule="auto"/>
-              <w:jc w:val="center"/>
-            </w:pPr>
-            <w:r>
-              <w:rPr>
-                <w:sz w:val="16"/>
-              </w:rPr>
-              <w:t xml:space="preserve">1.66 s / 161 MB</w:t>
-            </w:r>
-          </w:p>
-        </w:tc>
-        <w:tc>
-          <w:tcPr>
-            <w:tcW w:w="0" w:type="auto"/>
-          </w:tcPr>
-          <w:p>
-            <w:pPr>
-              <w:pStyle w:val="Compact"/>
-              <w:spacing w:before="0" w:after="0" w:line="240" w:lineRule="auto"/>
-              <w:jc w:val="center"/>
-            </w:pPr>
-            <w:r>
-              <w:rPr>
-                <w:sz w:val="16"/>
-              </w:rPr>
-              <w:t xml:space="preserve">6.92 s / 832 MB</w:t>
-            </w:r>
-          </w:p>
-        </w:tc>
-      </w:tr>
-    </w:tbl>
-    <w:p>
-      <w:pPr>
-        <w:pStyle w:val="BodyText"/>
-      </w:pPr>
-      <w:r>
-        <w:t xml:space="preserve">Strain2bScan reached median recall 1.0 from 1× onward; StrainScan was non-monotonic and did not exceed 0.800 median F1 at 0.5× or intermediate depths. The depth table aggregates heterogeneous strain mixtures and is not a causal depth-onset estimate.</w:t>
-      </w:r>
-    </w:p>
-    <w:p>
-      <w:r>
-        <w:br w:type="page"/>
-      </w:r>
-    </w:p>
-    <w:p>
-      <w:pPr>
-        <w:pStyle w:val="BodyText"/>
-      </w:pPr>
-      <w:r>
-        <w:rPr>
-          <w:b/>
-          <w:bCs/>
-        </w:rPr>
-        <w:t xml:space="preserve">Table 3. Multi-species community accuracy (reproducible rerun; medians) and archived profiling cost.</w:t>
-      </w:r>
-      <w:r>
-        <w:t xml:space="preserve"> </w:t>
-      </w:r>
-      <w:r>
-        <w:t xml:space="preserve">Current Strain2bScan values are from</w:t>
-      </w:r>
-      <w:r>
-        <w:t xml:space="preserve"> </w:t>
-      </w:r>
-      <w:r>
-        <w:rPr>
-          <w:rStyle w:val="VerbatimChar"/>
-        </w:rPr>
-        <w:t xml:space="preserve">results/strainscan_rerun/current_multi_persample.tsv</w:t>
-      </w:r>
-      <w:r>
-        <w:t xml:space="preserve">. Four samples per depth. Strain2bScan profiles each community in one digest-once pass; StrainScan has no multi-species mode, so archived cost is the sum over per-species runs.</w:t>
-      </w:r>
-    </w:p>
-    <w:tbl>
-      <w:tblPr>
-        <w:tblStyle w:val="Table"/>
-        <w:tblW w:type="pct" w:w="5000"/>
-        <w:jc w:val="center"/>
-        <w:tblBorders>
-          <w:top w:val="single" w:sz="4" w:space="0" w:color="B7C4D6"/>
-          <w:left w:val="single" w:sz="4" w:space="0" w:color="B7C4D6"/>
-          <w:bottom w:val="single" w:sz="4" w:space="0" w:color="B7C4D6"/>
-          <w:right w:val="single" w:sz="4" w:space="0" w:color="B7C4D6"/>
-          <w:insideH w:val="single" w:sz="4" w:space="0" w:color="B7C4D6"/>
-          <w:insideV w:val="single" w:sz="4" w:space="0" w:color="B7C4D6"/>
-        </w:tblBorders>
-        <w:tblLayout w:type="autofit"/>
-        <w:tblCellMar>
-          <w:top w:w="20" w:type="dxa"/>
-          <w:left w:w="55" w:type="dxa"/>
-          <w:bottom w:w="20" w:type="dxa"/>
-          <w:right w:w="55" w:type="dxa"/>
-        </w:tblCellMar>
-        <w:tblLook w:firstRow="1" w:lastRow="0" w:firstColumn="0" w:lastColumn="0" w:noHBand="0" w:noVBand="0" w:val="0020"/>
-      </w:tblPr>
-      <w:tblGrid>
-        <w:gridCol w:w="1250"/>
-        <w:gridCol w:w="1667"/>
-        <w:gridCol w:w="1667"/>
-        <w:gridCol w:w="1667"/>
-        <w:gridCol w:w="1667"/>
-      </w:tblGrid>
-      <w:tr>
-        <w:trPr>
-          <w:cantSplit/>
-          <w:tblHeader w:val="on"/>
-        </w:trPr>
-        <w:tc>
-          <w:tcPr>
-            <w:tcW w:w="0" w:type="auto"/>
-            <w:shd w:val="clear" w:color="auto" w:fill="DCE6F1"/>
-          </w:tcPr>
-          <w:p>
-            <w:pPr>
-              <w:pStyle w:val="Compact"/>
-              <w:spacing w:before="0" w:after="0" w:line="240" w:lineRule="auto"/>
-            </w:pPr>
-            <w:r>
-              <w:rPr>
-                <w:b/>
-                <w:sz w:val="17"/>
-              </w:rPr>
-              <w:t xml:space="preserve">Community depth</w:t>
-            </w:r>
-          </w:p>
-        </w:tc>
-        <w:tc>
-          <w:tcPr>
-            <w:tcW w:w="0" w:type="auto"/>
-            <w:shd w:val="clear" w:color="auto" w:fill="DCE6F1"/>
-          </w:tcPr>
-          <w:p>
-            <w:pPr>
-              <w:pStyle w:val="Compact"/>
-              <w:spacing w:before="0" w:after="0" w:line="240" w:lineRule="auto"/>
-              <w:jc w:val="center"/>
-            </w:pPr>
-            <w:r>
-              <w:rPr>
-                <w:b/>
-                <w:sz w:val="17"/>
-              </w:rPr>
-              <w:t xml:space="preserve">S2B P/R/F1</w:t>
-            </w:r>
-          </w:p>
-        </w:tc>
-        <w:tc>
-          <w:tcPr>
-            <w:tcW w:w="0" w:type="auto"/>
-            <w:shd w:val="clear" w:color="auto" w:fill="DCE6F1"/>
-          </w:tcPr>
-          <w:p>
-            <w:pPr>
-              <w:pStyle w:val="Compact"/>
-              <w:spacing w:before="0" w:after="0" w:line="240" w:lineRule="auto"/>
-              <w:jc w:val="center"/>
-            </w:pPr>
-            <w:r>
-              <w:rPr>
-                <w:b/>
-                <w:sz w:val="17"/>
-              </w:rPr>
-              <w:t xml:space="preserve">SS P/R/F1</w:t>
-            </w:r>
-          </w:p>
-        </w:tc>
-        <w:tc>
-          <w:tcPr>
-            <w:tcW w:w="0" w:type="auto"/>
-            <w:shd w:val="clear" w:color="auto" w:fill="DCE6F1"/>
-          </w:tcPr>
-          <w:p>
-            <w:pPr>
-              <w:pStyle w:val="Compact"/>
-              <w:spacing w:before="0" w:after="0" w:line="240" w:lineRule="auto"/>
-              <w:jc w:val="center"/>
-            </w:pPr>
-            <w:r>
-              <w:rPr>
-                <w:b/>
-                <w:sz w:val="17"/>
-              </w:rPr>
-              <w:t xml:space="preserve">S2B time/mem</w:t>
-            </w:r>
-          </w:p>
-        </w:tc>
-        <w:tc>
-          <w:tcPr>
-            <w:tcW w:w="0" w:type="auto"/>
-            <w:shd w:val="clear" w:color="auto" w:fill="DCE6F1"/>
-          </w:tcPr>
-          <w:p>
-            <w:pPr>
-              <w:pStyle w:val="Compact"/>
-              <w:spacing w:before="0" w:after="0" w:line="240" w:lineRule="auto"/>
-              <w:jc w:val="center"/>
-            </w:pPr>
-            <w:r>
-              <w:rPr>
-                <w:b/>
-                <w:sz w:val="17"/>
-              </w:rPr>
-              <w:t xml:space="preserve">SS time/mem</w:t>
-            </w:r>
-          </w:p>
-        </w:tc>
-      </w:tr>
-      <w:tr>
-        <w:trPr>
-          <w:cantSplit/>
-        </w:trPr>
-        <w:tc>
-          <w:tcPr>
-            <w:tcW w:w="0" w:type="auto"/>
-          </w:tcPr>
-          <w:p>
-            <w:pPr>
-              <w:pStyle w:val="Compact"/>
-              <w:spacing w:before="0" w:after="0" w:line="240" w:lineRule="auto"/>
-            </w:pPr>
-            <w:r>
-              <w:rPr>
-                <w:sz w:val="16"/>
-              </w:rPr>
-              <w:t xml:space="preserve">low</w:t>
-            </w:r>
-          </w:p>
-        </w:tc>
-        <w:tc>
-          <w:tcPr>
-            <w:tcW w:w="0" w:type="auto"/>
-          </w:tcPr>
-          <w:p>
-            <w:pPr>
-              <w:pStyle w:val="Compact"/>
-              <w:spacing w:before="0" w:after="0" w:line="240" w:lineRule="auto"/>
-              <w:jc w:val="center"/>
-            </w:pPr>
-            <w:r>
-              <w:rPr>
-                <w:sz w:val="16"/>
-              </w:rPr>
-              <w:t xml:space="preserve">0.748/0.667/0.699</w:t>
-            </w:r>
-          </w:p>
-        </w:tc>
-        <w:tc>
-          <w:tcPr>
-            <w:tcW w:w="0" w:type="auto"/>
-          </w:tcPr>
-          <w:p>
-            <w:pPr>
-              <w:pStyle w:val="Compact"/>
-              <w:spacing w:before="0" w:after="0" w:line="240" w:lineRule="auto"/>
-              <w:jc w:val="center"/>
-            </w:pPr>
-            <w:r>
-              <w:rPr>
-                <w:sz w:val="16"/>
-              </w:rPr>
-              <w:t xml:space="preserve">0.938/0.702/0.798</w:t>
-            </w:r>
-          </w:p>
-        </w:tc>
-        <w:tc>
-          <w:tcPr>
-            <w:tcW w:w="0" w:type="auto"/>
-          </w:tcPr>
-          <w:p>
-            <w:pPr>
-              <w:pStyle w:val="Compact"/>
-              <w:spacing w:before="0" w:after="0" w:line="240" w:lineRule="auto"/>
-              <w:jc w:val="center"/>
-            </w:pPr>
-            <w:r>
-              <w:rPr>
-                <w:sz w:val="16"/>
-              </w:rPr>
-              <w:t xml:space="preserve">1.0 s / 311 MB</w:t>
-            </w:r>
-          </w:p>
-        </w:tc>
-        <w:tc>
-          <w:tcPr>
-            <w:tcW w:w="0" w:type="auto"/>
-          </w:tcPr>
-          <w:p>
-            <w:pPr>
-              <w:pStyle w:val="Compact"/>
-              <w:spacing w:before="0" w:after="0" w:line="240" w:lineRule="auto"/>
-              <w:jc w:val="center"/>
-            </w:pPr>
-            <w:r>
-              <w:rPr>
-                <w:sz w:val="16"/>
-              </w:rPr>
-              <w:t xml:space="preserve">100 s / 1112 MB</w:t>
-            </w:r>
-          </w:p>
-        </w:tc>
-      </w:tr>
-      <w:tr>
-        <w:trPr>
-          <w:cantSplit/>
-        </w:trPr>
-        <w:tc>
-          <w:tcPr>
-            <w:tcW w:w="0" w:type="auto"/>
-          </w:tcPr>
-          <w:p>
-            <w:pPr>
-              <w:pStyle w:val="Compact"/>
-              <w:spacing w:before="0" w:after="0" w:line="240" w:lineRule="auto"/>
-            </w:pPr>
-            <w:r>
-              <w:rPr>
-                <w:sz w:val="16"/>
-              </w:rPr>
-              <w:t xml:space="preserve">med</w:t>
-            </w:r>
-          </w:p>
-        </w:tc>
-        <w:tc>
-          <w:tcPr>
-            <w:tcW w:w="0" w:type="auto"/>
-          </w:tcPr>
-          <w:p>
-            <w:pPr>
-              <w:pStyle w:val="Compact"/>
-              <w:spacing w:before="0" w:after="0" w:line="240" w:lineRule="auto"/>
-              <w:jc w:val="center"/>
-            </w:pPr>
-            <w:r>
-              <w:rPr>
-                <w:sz w:val="16"/>
-              </w:rPr>
-              <w:t xml:space="preserve">0.838/0.838/0.837</w:t>
-            </w:r>
-          </w:p>
-        </w:tc>
-        <w:tc>
-          <w:tcPr>
-            <w:tcW w:w="0" w:type="auto"/>
-          </w:tcPr>
-          <w:p>
-            <w:pPr>
-              <w:pStyle w:val="Compact"/>
-              <w:spacing w:before="0" w:after="0" w:line="240" w:lineRule="auto"/>
-              <w:jc w:val="center"/>
-            </w:pPr>
-            <w:r>
-              <w:rPr>
-                <w:sz w:val="16"/>
-              </w:rPr>
-              <w:t xml:space="preserve">0.954/0.903/0.927</w:t>
-            </w:r>
-          </w:p>
-        </w:tc>
-        <w:tc>
-          <w:tcPr>
-            <w:tcW w:w="0" w:type="auto"/>
-          </w:tcPr>
-          <w:p>
-            <w:pPr>
-              <w:pStyle w:val="Compact"/>
-              <w:spacing w:before="0" w:after="0" w:line="240" w:lineRule="auto"/>
-              <w:jc w:val="center"/>
-            </w:pPr>
-            <w:r>
-              <w:rPr>
-                <w:sz w:val="16"/>
-              </w:rPr>
-              <w:t xml:space="preserve">4.3 s / 670 MB</w:t>
-            </w:r>
-          </w:p>
-        </w:tc>
-        <w:tc>
-          <w:tcPr>
-            <w:tcW w:w="0" w:type="auto"/>
-          </w:tcPr>
-          <w:p>
-            <w:pPr>
-              <w:pStyle w:val="Compact"/>
-              <w:spacing w:before="0" w:after="0" w:line="240" w:lineRule="auto"/>
-              <w:jc w:val="center"/>
-            </w:pPr>
-            <w:r>
-              <w:rPr>
-                <w:sz w:val="16"/>
-              </w:rPr>
-              <w:t xml:space="preserve">228 s / 1696 MB</w:t>
-            </w:r>
-          </w:p>
-        </w:tc>
-      </w:tr>
-      <w:tr>
-        <w:trPr>
-          <w:cantSplit/>
-        </w:trPr>
-        <w:tc>
-          <w:tcPr>
-            <w:tcW w:w="0" w:type="auto"/>
-          </w:tcPr>
-          <w:p>
-            <w:pPr>
-              <w:pStyle w:val="Compact"/>
-              <w:spacing w:before="0" w:after="0" w:line="240" w:lineRule="auto"/>
-            </w:pPr>
-            <w:r>
-              <w:rPr>
-                <w:sz w:val="16"/>
-              </w:rPr>
-              <w:t xml:space="preserve">high</w:t>
-            </w:r>
-          </w:p>
-        </w:tc>
-        <w:tc>
-          <w:tcPr>
-            <w:tcW w:w="0" w:type="auto"/>
-          </w:tcPr>
-          <w:p>
-            <w:pPr>
-              <w:pStyle w:val="Compact"/>
-              <w:spacing w:before="0" w:after="0" w:line="240" w:lineRule="auto"/>
-              <w:jc w:val="center"/>
-            </w:pPr>
-            <w:r>
-              <w:rPr>
-                <w:sz w:val="16"/>
-              </w:rPr>
-              <w:t xml:space="preserve">0.806/0.806/0.806</w:t>
-            </w:r>
-          </w:p>
-        </w:tc>
-        <w:tc>
-          <w:tcPr>
-            <w:tcW w:w="0" w:type="auto"/>
-          </w:tcPr>
-          <w:p>
-            <w:pPr>
-              <w:pStyle w:val="Compact"/>
-              <w:spacing w:before="0" w:after="0" w:line="240" w:lineRule="auto"/>
-              <w:jc w:val="center"/>
-            </w:pPr>
-            <w:r>
-              <w:rPr>
-                <w:sz w:val="16"/>
-              </w:rPr>
-              <w:t xml:space="preserve">0.972/0.958/0.965</w:t>
+              <w:t xml:space="preserve">0.908/1.000/0.951</w:t>
             </w:r>
           </w:p>
         </w:tc>
@@ -23035,7 +23207,7 @@
               <w:rPr>
                 <w:sz w:val="16"/>
               </w:rPr>
-              <w:t xml:space="preserve">Related shotgun comparator rerun in Table 9; StrainGR was not run.</w:t>
+              <w:t xml:space="preserve">StrainGST completed 225 single-species simulations, 12 multi-species communities and four ATCC WMS mocks (Tables 1–3 and 9); StrainGR was not run.</w:t>
             </w:r>
           </w:p>
         </w:tc>
@@ -25176,6 +25348,380 @@
         <w:t xml:space="preserve">.</w:t>
       </w:r>
     </w:p>
+    <w:p>
+      <w:r>
+        <w:br w:type="page"/>
+      </w:r>
+    </w:p>
+    <w:p>
+      <w:pPr>
+        <w:pStyle w:val="BodyText"/>
+      </w:pPr>
+      <w:r>
+        <w:rPr>
+          <w:b/>
+          <w:bCs/>
+        </w:rPr>
+        <w:t xml:space="preserve">Table S4. Failure-aware sensitivity for all 225 matched single-species entries.</w:t>
+      </w:r>
+      <w:r>
+        <w:t xml:space="preserve"> </w:t>
+      </w:r>
+      <w:r>
+        <w:t xml:space="preserve">Absent StrainScan final reports were retained and scored as zero detection. Failure-as-absence assigns zero recall to absent reports and uses a species-cluster bootstrap; precision and F1 are not assigned to no-report failures. Source:</w:t>
+      </w:r>
+      <w:r>
+        <w:t xml:space="preserve"> </w:t>
+      </w:r>
+      <w:r>
+        <w:rPr>
+          <w:rStyle w:val="VerbatimChar"/>
+        </w:rPr>
+        <w:t xml:space="preserve">results/strainscan_rerun/current_single_persample.tsv</w:t>
+      </w:r>
+      <w:r>
+        <w:t xml:space="preserve"> </w:t>
+      </w:r>
+      <w:r>
+        <w:t xml:space="preserve">and</w:t>
+      </w:r>
+      <w:r>
+        <w:t xml:space="preserve"> </w:t>
+      </w:r>
+      <w:r>
+        <w:rPr>
+          <w:rStyle w:val="VerbatimChar"/>
+        </w:rPr>
+        <w:t xml:space="preserve">results/strainscan_rerun/current_uncertainty_summary.tsv</w:t>
+      </w:r>
+      <w:r>
+        <w:t xml:space="preserve">.</w:t>
+      </w:r>
+    </w:p>
+    <w:tbl>
+      <w:tblPr>
+        <w:tblStyle w:val="Table"/>
+        <w:tblW w:type="pct" w:w="5000"/>
+        <w:jc w:val="center"/>
+        <w:tblBorders>
+          <w:top w:val="single" w:sz="4" w:space="0" w:color="B7C4D6"/>
+          <w:left w:val="single" w:sz="4" w:space="0" w:color="B7C4D6"/>
+          <w:bottom w:val="single" w:sz="4" w:space="0" w:color="B7C4D6"/>
+          <w:right w:val="single" w:sz="4" w:space="0" w:color="B7C4D6"/>
+          <w:insideH w:val="single" w:sz="4" w:space="0" w:color="B7C4D6"/>
+          <w:insideV w:val="single" w:sz="4" w:space="0" w:color="B7C4D6"/>
+        </w:tblBorders>
+        <w:tblLayout w:type="autofit"/>
+        <w:tblCellMar>
+          <w:top w:w="20" w:type="dxa"/>
+          <w:left w:w="55" w:type="dxa"/>
+          <w:bottom w:w="20" w:type="dxa"/>
+          <w:right w:w="55" w:type="dxa"/>
+        </w:tblCellMar>
+        <w:tblLook w:firstRow="1" w:lastRow="0" w:firstColumn="0" w:lastColumn="0" w:noHBand="0" w:noVBand="0" w:val="0020"/>
+      </w:tblPr>
+      <w:tblGrid>
+        <w:gridCol w:w="1485"/>
+        <w:gridCol w:w="1485"/>
+        <w:gridCol w:w="1485"/>
+        <w:gridCol w:w="1980"/>
+        <w:gridCol w:w="1485"/>
+      </w:tblGrid>
+      <w:tr>
+        <w:trPr>
+          <w:cantSplit/>
+          <w:tblHeader w:val="on"/>
+        </w:trPr>
+        <w:tc>
+          <w:tcPr>
+            <w:tcW w:w="0" w:type="auto"/>
+            <w:shd w:val="clear" w:color="auto" w:fill="DCE6F1"/>
+          </w:tcPr>
+          <w:p>
+            <w:pPr>
+              <w:pStyle w:val="Compact"/>
+              <w:spacing w:before="0" w:after="0" w:line="240" w:lineRule="auto"/>
+            </w:pPr>
+            <w:r>
+              <w:rPr>
+                <w:b/>
+                <w:sz w:val="17"/>
+              </w:rPr>
+              <w:t xml:space="preserve">Analysis</w:t>
+            </w:r>
+          </w:p>
+        </w:tc>
+        <w:tc>
+          <w:tcPr>
+            <w:tcW w:w="0" w:type="auto"/>
+            <w:shd w:val="clear" w:color="auto" w:fill="DCE6F1"/>
+          </w:tcPr>
+          <w:p>
+            <w:pPr>
+              <w:pStyle w:val="Compact"/>
+              <w:spacing w:before="0" w:after="0" w:line="240" w:lineRule="auto"/>
+              <w:jc w:val="right"/>
+            </w:pPr>
+            <w:r>
+              <w:rPr>
+                <w:b/>
+                <w:sz w:val="17"/>
+              </w:rPr>
+              <w:t xml:space="preserve">n</w:t>
+            </w:r>
+          </w:p>
+        </w:tc>
+        <w:tc>
+          <w:tcPr>
+            <w:tcW w:w="0" w:type="auto"/>
+            <w:shd w:val="clear" w:color="auto" w:fill="DCE6F1"/>
+          </w:tcPr>
+          <w:p>
+            <w:pPr>
+              <w:pStyle w:val="Compact"/>
+              <w:spacing w:before="0" w:after="0" w:line="240" w:lineRule="auto"/>
+              <w:jc w:val="right"/>
+            </w:pPr>
+            <w:r>
+              <w:rPr>
+                <w:b/>
+                <w:sz w:val="17"/>
+              </w:rPr>
+              <w:t xml:space="preserve">No-calls</w:t>
+            </w:r>
+          </w:p>
+        </w:tc>
+        <w:tc>
+          <w:tcPr>
+            <w:tcW w:w="0" w:type="auto"/>
+            <w:shd w:val="clear" w:color="auto" w:fill="DCE6F1"/>
+          </w:tcPr>
+          <w:p>
+            <w:pPr>
+              <w:pStyle w:val="Compact"/>
+              <w:spacing w:before="0" w:after="0" w:line="240" w:lineRule="auto"/>
+              <w:jc w:val="center"/>
+            </w:pPr>
+            <w:r>
+              <w:rPr>
+                <w:b/>
+                <w:sz w:val="17"/>
+              </w:rPr>
+              <w:t xml:space="preserve">Mean recall difference (95% CI)</w:t>
+            </w:r>
+          </w:p>
+        </w:tc>
+        <w:tc>
+          <w:tcPr>
+            <w:tcW w:w="0" w:type="auto"/>
+            <w:shd w:val="clear" w:color="auto" w:fill="DCE6F1"/>
+          </w:tcPr>
+          <w:p>
+            <w:pPr>
+              <w:pStyle w:val="Compact"/>
+              <w:spacing w:before="0" w:after="0" w:line="240" w:lineRule="auto"/>
+              <w:jc w:val="right"/>
+            </w:pPr>
+            <w:r>
+              <w:rPr>
+                <w:b/>
+                <w:sz w:val="17"/>
+              </w:rPr>
+              <w:t xml:space="preserve">No-call rate</w:t>
+            </w:r>
+          </w:p>
+        </w:tc>
+      </w:tr>
+      <w:tr>
+        <w:trPr>
+          <w:cantSplit/>
+        </w:trPr>
+        <w:tc>
+          <w:tcPr>
+            <w:tcW w:w="0" w:type="auto"/>
+          </w:tcPr>
+          <w:p>
+            <w:pPr>
+              <w:pStyle w:val="Compact"/>
+              <w:spacing w:before="0" w:after="0" w:line="240" w:lineRule="auto"/>
+            </w:pPr>
+            <w:r>
+              <w:rPr>
+                <w:sz w:val="16"/>
+              </w:rPr>
+              <w:t xml:space="preserve">Completed pairs</w:t>
+            </w:r>
+          </w:p>
+        </w:tc>
+        <w:tc>
+          <w:tcPr>
+            <w:tcW w:w="0" w:type="auto"/>
+          </w:tcPr>
+          <w:p>
+            <w:pPr>
+              <w:pStyle w:val="Compact"/>
+              <w:spacing w:before="0" w:after="0" w:line="240" w:lineRule="auto"/>
+              <w:jc w:val="right"/>
+            </w:pPr>
+            <w:r>
+              <w:rPr>
+                <w:sz w:val="16"/>
+              </w:rPr>
+              <w:t xml:space="preserve">204</w:t>
+            </w:r>
+          </w:p>
+        </w:tc>
+        <w:tc>
+          <w:tcPr>
+            <w:tcW w:w="0" w:type="auto"/>
+          </w:tcPr>
+          <w:p>
+            <w:pPr>
+              <w:pStyle w:val="Compact"/>
+              <w:spacing w:before="0" w:after="0" w:line="240" w:lineRule="auto"/>
+              <w:jc w:val="right"/>
+            </w:pPr>
+            <w:r>
+              <w:rPr>
+                <w:sz w:val="16"/>
+              </w:rPr>
+              <w:t xml:space="preserve">0</w:t>
+            </w:r>
+          </w:p>
+        </w:tc>
+        <w:tc>
+          <w:tcPr>
+            <w:tcW w:w="0" w:type="auto"/>
+          </w:tcPr>
+          <w:p>
+            <w:pPr>
+              <w:pStyle w:val="Compact"/>
+              <w:spacing w:before="0" w:after="0" w:line="240" w:lineRule="auto"/>
+              <w:jc w:val="center"/>
+            </w:pPr>
+            <w:r>
+              <w:rPr>
+                <w:sz w:val="16"/>
+              </w:rPr>
+              <w:t xml:space="preserve">+0.063 (−0.037 to 0.133)</w:t>
+            </w:r>
+          </w:p>
+        </w:tc>
+        <w:tc>
+          <w:tcPr>
+            <w:tcW w:w="0" w:type="auto"/>
+          </w:tcPr>
+          <w:p>
+            <w:pPr>
+              <w:pStyle w:val="Compact"/>
+              <w:spacing w:before="0" w:after="0" w:line="240" w:lineRule="auto"/>
+              <w:jc w:val="right"/>
+            </w:pPr>
+            <w:r>
+              <w:rPr>
+                <w:sz w:val="16"/>
+              </w:rPr>
+              <w:t xml:space="preserve">0%</w:t>
+            </w:r>
+          </w:p>
+        </w:tc>
+      </w:tr>
+      <w:tr>
+        <w:trPr>
+          <w:cantSplit/>
+        </w:trPr>
+        <w:tc>
+          <w:tcPr>
+            <w:tcW w:w="0" w:type="auto"/>
+          </w:tcPr>
+          <w:p>
+            <w:pPr>
+              <w:pStyle w:val="Compact"/>
+              <w:spacing w:before="0" w:after="0" w:line="240" w:lineRule="auto"/>
+            </w:pPr>
+            <w:r>
+              <w:rPr>
+                <w:sz w:val="16"/>
+              </w:rPr>
+              <w:t xml:space="preserve">Failure as absence</w:t>
+            </w:r>
+          </w:p>
+        </w:tc>
+        <w:tc>
+          <w:tcPr>
+            <w:tcW w:w="0" w:type="auto"/>
+          </w:tcPr>
+          <w:p>
+            <w:pPr>
+              <w:pStyle w:val="Compact"/>
+              <w:spacing w:before="0" w:after="0" w:line="240" w:lineRule="auto"/>
+              <w:jc w:val="right"/>
+            </w:pPr>
+            <w:r>
+              <w:rPr>
+                <w:sz w:val="16"/>
+              </w:rPr>
+              <w:t xml:space="preserve">225</w:t>
+            </w:r>
+          </w:p>
+        </w:tc>
+        <w:tc>
+          <w:tcPr>
+            <w:tcW w:w="0" w:type="auto"/>
+          </w:tcPr>
+          <w:p>
+            <w:pPr>
+              <w:pStyle w:val="Compact"/>
+              <w:spacing w:before="0" w:after="0" w:line="240" w:lineRule="auto"/>
+              <w:jc w:val="right"/>
+            </w:pPr>
+            <w:r>
+              <w:rPr>
+                <w:sz w:val="16"/>
+              </w:rPr>
+              <w:t xml:space="preserve">21</w:t>
+            </w:r>
+          </w:p>
+        </w:tc>
+        <w:tc>
+          <w:tcPr>
+            <w:tcW w:w="0" w:type="auto"/>
+          </w:tcPr>
+          <w:p>
+            <w:pPr>
+              <w:pStyle w:val="Compact"/>
+              <w:spacing w:before="0" w:after="0" w:line="240" w:lineRule="auto"/>
+              <w:jc w:val="center"/>
+            </w:pPr>
+            <w:r>
+              <w:rPr>
+                <w:sz w:val="16"/>
+              </w:rPr>
+              <w:t xml:space="preserve">+0.127 (0.007 to 0.248)</w:t>
+            </w:r>
+          </w:p>
+        </w:tc>
+        <w:tc>
+          <w:tcPr>
+            <w:tcW w:w="0" w:type="auto"/>
+          </w:tcPr>
+          <w:p>
+            <w:pPr>
+              <w:pStyle w:val="Compact"/>
+              <w:spacing w:before="0" w:after="0" w:line="240" w:lineRule="auto"/>
+              <w:jc w:val="right"/>
+            </w:pPr>
+            <w:r>
+              <w:rPr>
+                <w:sz w:val="16"/>
+              </w:rPr>
+              <w:t xml:space="preserve">9.33%</w:t>
+            </w:r>
+          </w:p>
+        </w:tc>
+      </w:tr>
+    </w:tbl>
+    <w:p/>
     <w:tbl>
       <w:tblPr>
         <w:tblStyle w:val="Table"/>
@@ -28793,7 +29339,7 @@
         <w:t xml:space="preserve"> </w:t>
       </w:r>
       <w:r>
-        <w:t xml:space="preserve">2024; 43(8):1348–1359. doi:10.1038/s41587-024-02412-y.</w:t>
+        <w:t xml:space="preserve">2025; 43(8):1348–1359 (published online 2024). doi:10.1038/s41587-024-02412-y.</w:t>
       </w:r>
     </w:p>
     <w:p>
@@ -29798,40 +30344,6 @@
       </w:r>
       <w:r>
         <w:t xml:space="preserve">9(4):357–359. doi:10.1038/nmeth.1923.</w:t>
-      </w:r>
-    </w:p>
-    <w:p>
-      <w:pPr>
-        <w:pStyle w:val="Compact"/>
-        <w:numPr>
-          <w:ilvl w:val="0"/>
-          <w:numId w:val="1003"/>
-        </w:numPr>
-      </w:pPr>
-      <w:r>
-        <w:t xml:space="preserve">Li H.</w:t>
-      </w:r>
-      <w:r>
-        <w:t xml:space="preserve"> </w:t>
-      </w:r>
-      <w:r>
-        <w:rPr>
-          <w:b/>
-          <w:bCs/>
-        </w:rPr>
-        <w:t xml:space="preserve">Aligning sequence reads, clone sequences and assembly contigs with BWA-MEM.</w:t>
-      </w:r>
-      <w:r>
-        <w:t xml:space="preserve"> </w:t>
-      </w:r>
-      <w:r>
-        <w:t xml:space="preserve">arXiv:1303.3997</w:t>
-      </w:r>
-      <w:r>
-        <w:t xml:space="preserve"> </w:t>
-      </w:r>
-      <w:r>
-        <w:t xml:space="preserve">(2013).</w:t>
       </w:r>
     </w:p>
     <w:p>

</xml_diff>